<commit_message>
Update investor content for 2026-06-18
</commit_message>
<xml_diff>
--- a/public/investor-downloads/daily-brief-2026-06-18.docx
+++ b/public/investor-downloads/daily-brief-2026-06-18.docx
@@ -8,7 +8,7 @@
       </w:pPr>
       <w:r>
         <w:rPr>
-          <w:rFonts w:ascii="Calibri" w:hAnsi="Calibri" w:eastAsia="Heiti TC"/>
+          <w:rFonts w:ascii="Calibri" w:hAnsi="Calibri" w:eastAsia="Songti SC"/>
           <w:b/>
           <w:i w:val="0"/>
           <w:color w:val="285B9D"/>
@@ -24,7 +24,7 @@
       </w:pPr>
       <w:r>
         <w:rPr>
-          <w:rFonts w:ascii="Calibri" w:hAnsi="Calibri" w:eastAsia="Heiti TC"/>
+          <w:rFonts w:ascii="Calibri" w:hAnsi="Calibri" w:eastAsia="Songti SC"/>
           <w:b w:val="0"/>
           <w:i w:val="0"/>
         </w:rPr>
@@ -38,7 +38,7 @@
       </w:pPr>
       <w:r>
         <w:rPr>
-          <w:rFonts w:ascii="Calibri" w:hAnsi="Calibri" w:eastAsia="Heiti TC"/>
+          <w:rFonts w:ascii="Calibri" w:hAnsi="Calibri" w:eastAsia="Songti SC"/>
           <w:b w:val="0"/>
           <w:i w:val="0"/>
         </w:rPr>
@@ -51,7 +51,7 @@
       </w:pPr>
       <w:r>
         <w:rPr>
-          <w:rFonts w:ascii="Calibri" w:hAnsi="Calibri" w:eastAsia="Heiti TC"/>
+          <w:rFonts w:ascii="Calibri" w:hAnsi="Calibri" w:eastAsia="Songti SC"/>
           <w:b/>
           <w:i w:val="0"/>
           <w:color w:val="0B2545"/>
@@ -66,13 +66,13 @@
       </w:pPr>
       <w:r>
         <w:rPr>
-          <w:rFonts w:ascii="Calibri" w:hAnsi="Calibri" w:eastAsia="Heiti TC"/>
+          <w:rFonts w:ascii="Calibri" w:hAnsi="Calibri" w:eastAsia="Songti SC"/>
           <w:b w:val="0"/>
           <w:i w:val="0"/>
           <w:color w:val="334155"/>
           <w:sz w:val="22"/>
         </w:rPr>
-        <w:t>2026-06-18 共纳入 94 篇中文研究结果，覆盖 12 位活跃分析师和 6 条主要行业链，较 2026-06-17 的主题变化可在右侧动量表中核对。简报优先呈现可被报告链接追溯的结论，而不是孤立摘要。</w:t>
+        <w:t>2026-06-18 共纳入 178 篇中文研究结果，覆盖 26 位活跃分析师和 6 条主要行业链，较 2026-06-17 的主题变化可在右侧动量表中核对。简报优先呈现可被报告链接追溯的结论，而不是孤立摘要。</w:t>
       </w:r>
     </w:p>
     <w:tbl>
@@ -101,7 +101,7 @@
             </w:pPr>
             <w:r>
               <w:rPr>
-                <w:rFonts w:ascii="Calibri" w:hAnsi="Calibri" w:eastAsia="Heiti TC"/>
+                <w:rFonts w:ascii="Calibri" w:hAnsi="Calibri" w:eastAsia="Songti SC"/>
                 <w:b/>
                 <w:color w:val="667085"/>
                 <w:sz w:val="17"/>
@@ -111,12 +111,12 @@
             </w:r>
             <w:r>
               <w:rPr>
-                <w:rFonts w:ascii="Calibri" w:hAnsi="Calibri" w:eastAsia="Heiti TC"/>
+                <w:rFonts w:ascii="Calibri" w:hAnsi="Calibri" w:eastAsia="Songti SC"/>
                 <w:b/>
                 <w:color w:val="285B9D"/>
                 <w:sz w:val="36"/>
               </w:rPr>
-              <w:t>94</w:t>
+              <w:t>178</w:t>
             </w:r>
           </w:p>
         </w:tc>
@@ -132,7 +132,7 @@
             </w:pPr>
             <w:r>
               <w:rPr>
-                <w:rFonts w:ascii="Calibri" w:hAnsi="Calibri" w:eastAsia="Heiti TC"/>
+                <w:rFonts w:ascii="Calibri" w:hAnsi="Calibri" w:eastAsia="Songti SC"/>
                 <w:b/>
                 <w:color w:val="667085"/>
                 <w:sz w:val="17"/>
@@ -142,12 +142,12 @@
             </w:r>
             <w:r>
               <w:rPr>
-                <w:rFonts w:ascii="Calibri" w:hAnsi="Calibri" w:eastAsia="Heiti TC"/>
+                <w:rFonts w:ascii="Calibri" w:hAnsi="Calibri" w:eastAsia="Songti SC"/>
                 <w:b/>
                 <w:color w:val="237A5B"/>
                 <w:sz w:val="36"/>
               </w:rPr>
-              <w:t>12</w:t>
+              <w:t>26</w:t>
             </w:r>
           </w:p>
         </w:tc>
@@ -163,7 +163,7 @@
             </w:pPr>
             <w:r>
               <w:rPr>
-                <w:rFonts w:ascii="Calibri" w:hAnsi="Calibri" w:eastAsia="Heiti TC"/>
+                <w:rFonts w:ascii="Calibri" w:hAnsi="Calibri" w:eastAsia="Songti SC"/>
                 <w:b/>
                 <w:color w:val="667085"/>
                 <w:sz w:val="17"/>
@@ -173,7 +173,7 @@
             </w:r>
             <w:r>
               <w:rPr>
-                <w:rFonts w:ascii="Calibri" w:hAnsi="Calibri" w:eastAsia="Heiti TC"/>
+                <w:rFonts w:ascii="Calibri" w:hAnsi="Calibri" w:eastAsia="Songti SC"/>
                 <w:b/>
                 <w:color w:val="A8731B"/>
                 <w:sz w:val="36"/>
@@ -194,7 +194,7 @@
             </w:pPr>
             <w:r>
               <w:rPr>
-                <w:rFonts w:ascii="Calibri" w:hAnsi="Calibri" w:eastAsia="Heiti TC"/>
+                <w:rFonts w:ascii="Calibri" w:hAnsi="Calibri" w:eastAsia="Songti SC"/>
                 <w:b/>
                 <w:color w:val="667085"/>
                 <w:sz w:val="17"/>
@@ -204,7 +204,7 @@
             </w:r>
             <w:r>
               <w:rPr>
-                <w:rFonts w:ascii="Calibri" w:hAnsi="Calibri" w:eastAsia="Heiti TC"/>
+                <w:rFonts w:ascii="Calibri" w:hAnsi="Calibri" w:eastAsia="Songti SC"/>
                 <w:b/>
                 <w:color w:val="B43D49"/>
                 <w:sz w:val="36"/>
@@ -268,7 +268,7 @@
       </w:pPr>
       <w:r>
         <w:rPr>
-          <w:rFonts w:ascii="Calibri" w:hAnsi="Calibri" w:eastAsia="Heiti TC"/>
+          <w:rFonts w:ascii="Calibri" w:hAnsi="Calibri" w:eastAsia="Songti SC"/>
           <w:b w:val="0"/>
           <w:i/>
           <w:color w:val="667085"/>
@@ -292,7 +292,7 @@
       </w:pPr>
       <w:r>
         <w:rPr>
-          <w:rFonts w:ascii="Calibri" w:hAnsi="Calibri" w:eastAsia="Heiti TC"/>
+          <w:rFonts w:ascii="Calibri" w:hAnsi="Calibri" w:eastAsia="Songti SC"/>
           <w:b/>
           <w:color w:val="285B9D"/>
           <w:sz w:val="21"/>
@@ -304,7 +304,7 @@
           <w:rPr>
             <w:color w:val="285B9D"/>
             <w:u w:val="single"/>
-            <w:rFonts w:eastAsia="Heiti TC" w:ascii="Calibri" w:hAnsi="Calibri"/>
+            <w:rFonts w:eastAsia="Songti SC" w:ascii="Calibri" w:hAnsi="Calibri"/>
           </w:rPr>
           <w:t>终审质量审计：AI至电网基础设施白皮书 — 2026-06-18 是今日最高权重结论，核心证据来自 未识别，关联 AI 基础设施。</w:t>
         </w:r>
@@ -317,7 +317,7 @@
       </w:pPr>
       <w:r>
         <w:rPr>
-          <w:rFonts w:ascii="Calibri" w:hAnsi="Calibri" w:eastAsia="Heiti TC"/>
+          <w:rFonts w:ascii="Calibri" w:hAnsi="Calibri" w:eastAsia="Songti SC"/>
           <w:b/>
           <w:color w:val="285B9D"/>
           <w:sz w:val="21"/>
@@ -326,11 +326,11 @@
       </w:r>
       <w:r>
         <w:rPr>
-          <w:rFonts w:ascii="Calibri" w:hAnsi="Calibri" w:eastAsia="Heiti TC"/>
+          <w:rFonts w:ascii="Calibri" w:hAnsi="Calibri" w:eastAsia="Songti SC"/>
           <w:color w:val="111827"/>
           <w:sz w:val="21"/>
         </w:rPr>
-        <w:t>AI 今日 降温，当日计数 80，前一日计数 170。</w:t>
+        <w:t>A股 今日 降温，当日计数 96，前一日计数 127。</w:t>
       </w:r>
     </w:p>
     <w:p>
@@ -340,7 +340,7 @@
       </w:pPr>
       <w:r>
         <w:rPr>
-          <w:rFonts w:ascii="Calibri" w:hAnsi="Calibri" w:eastAsia="Heiti TC"/>
+          <w:rFonts w:ascii="Calibri" w:hAnsi="Calibri" w:eastAsia="Songti SC"/>
           <w:b/>
           <w:color w:val="285B9D"/>
           <w:sz w:val="21"/>
@@ -352,7 +352,7 @@
           <w:rPr>
             <w:color w:val="285B9D"/>
             <w:u w:val="single"/>
-            <w:rFonts w:eastAsia="Heiti TC" w:ascii="Calibri" w:hAnsi="Calibri"/>
+            <w:rFonts w:eastAsia="Songti SC" w:ascii="Calibri" w:hAnsi="Calibri"/>
           </w:rPr>
           <w:t>风险矩阵最需要跟踪的是 AI 基础设施：跨越电力约束：AI基础设施瓶颈向全球权益市场的配置与估值映射。</w:t>
         </w:r>
@@ -365,7 +365,7 @@
       </w:pPr>
       <w:r>
         <w:rPr>
-          <w:rFonts w:ascii="Calibri" w:hAnsi="Calibri" w:eastAsia="Heiti TC"/>
+          <w:rFonts w:ascii="Calibri" w:hAnsi="Calibri" w:eastAsia="Songti SC"/>
           <w:b/>
           <w:color w:val="285B9D"/>
           <w:sz w:val="21"/>
@@ -377,9 +377,9 @@
           <w:rPr>
             <w:color w:val="285B9D"/>
             <w:u w:val="single"/>
-            <w:rFonts w:eastAsia="Heiti TC" w:ascii="Calibri" w:hAnsi="Calibri"/>
+            <w:rFonts w:eastAsia="Songti SC" w:ascii="Calibri" w:hAnsi="Calibri"/>
           </w:rPr>
-          <w:t>宏观通胀传导 今日 89 条、近七日 1378 条，风险信号 1009 条。</w:t>
+          <w:t>宏观通胀传导 今日 168 条、近七日 1470 条，风险信号 1072 条。</w:t>
         </w:r>
       </w:hyperlink>
     </w:p>
@@ -403,7 +403,7 @@
           <w:p>
             <w:r>
               <w:rPr>
-                <w:rFonts w:ascii="Calibri" w:hAnsi="Calibri" w:eastAsia="Heiti TC"/>
+                <w:rFonts w:ascii="Calibri" w:hAnsi="Calibri" w:eastAsia="Songti SC"/>
                 <w:b/>
                 <w:color w:val="7A5A00"/>
                 <w:sz w:val="21"/>
@@ -412,7 +412,7 @@
             </w:r>
             <w:r>
               <w:rPr>
-                <w:rFonts w:ascii="Calibri" w:hAnsi="Calibri" w:eastAsia="Heiti TC"/>
+                <w:rFonts w:ascii="Calibri" w:hAnsi="Calibri" w:eastAsia="Songti SC"/>
                 <w:color w:val="7C2D12"/>
                 <w:sz w:val="21"/>
               </w:rPr>
@@ -483,7 +483,7 @@
       </w:pPr>
       <w:r>
         <w:rPr>
-          <w:rFonts w:ascii="Calibri" w:hAnsi="Calibri" w:eastAsia="Heiti TC"/>
+          <w:rFonts w:ascii="Calibri" w:hAnsi="Calibri" w:eastAsia="Songti SC"/>
           <w:b w:val="0"/>
           <w:i/>
           <w:color w:val="667085"/>
@@ -540,7 +540,7 @@
       </w:pPr>
       <w:r>
         <w:rPr>
-          <w:rFonts w:ascii="Calibri" w:hAnsi="Calibri" w:eastAsia="Heiti TC"/>
+          <w:rFonts w:ascii="Calibri" w:hAnsi="Calibri" w:eastAsia="Songti SC"/>
           <w:b w:val="0"/>
           <w:i/>
           <w:color w:val="667085"/>
@@ -602,7 +602,7 @@
       </w:pPr>
       <w:r>
         <w:rPr>
-          <w:rFonts w:ascii="Calibri" w:hAnsi="Calibri" w:eastAsia="Heiti TC"/>
+          <w:rFonts w:ascii="Calibri" w:hAnsi="Calibri" w:eastAsia="Songti SC"/>
           <w:b w:val="0"/>
           <w:i/>
           <w:color w:val="667085"/>
@@ -664,7 +664,7 @@
       </w:pPr>
       <w:r>
         <w:rPr>
-          <w:rFonts w:ascii="Calibri" w:hAnsi="Calibri" w:eastAsia="Heiti TC"/>
+          <w:rFonts w:ascii="Calibri" w:hAnsi="Calibri" w:eastAsia="Songti SC"/>
           <w:b w:val="0"/>
           <w:i/>
           <w:color w:val="667085"/>
@@ -687,7 +687,7 @@
       </w:pPr>
       <w:r>
         <w:rPr>
-          <w:rFonts w:ascii="Calibri" w:hAnsi="Calibri" w:eastAsia="Heiti TC"/>
+          <w:rFonts w:ascii="Calibri" w:hAnsi="Calibri" w:eastAsia="Songti SC"/>
           <w:b/>
           <w:i w:val="0"/>
           <w:color w:val="0B2545"/>
@@ -702,7 +702,7 @@
       </w:pPr>
       <w:r>
         <w:rPr>
-          <w:rFonts w:ascii="Calibri" w:hAnsi="Calibri" w:eastAsia="Heiti TC"/>
+          <w:rFonts w:ascii="Calibri" w:hAnsi="Calibri" w:eastAsia="Songti SC"/>
           <w:b w:val="0"/>
           <w:i w:val="0"/>
           <w:color w:val="667085"/>
@@ -717,7 +717,7 @@
       </w:pPr>
       <w:r>
         <w:rPr>
-          <w:rFonts w:ascii="Calibri" w:hAnsi="Calibri" w:eastAsia="Heiti TC"/>
+          <w:rFonts w:ascii="Calibri" w:hAnsi="Calibri" w:eastAsia="Songti SC"/>
           <w:b w:val="0"/>
           <w:i w:val="0"/>
           <w:color w:val="334155"/>
@@ -732,7 +732,7 @@
       </w:pPr>
       <w:r>
         <w:rPr>
-          <w:rFonts w:ascii="Calibri" w:hAnsi="Calibri" w:eastAsia="Heiti TC"/>
+          <w:rFonts w:ascii="Calibri" w:hAnsi="Calibri" w:eastAsia="Songti SC"/>
           <w:b w:val="0"/>
           <w:i w:val="0"/>
           <w:color w:val="667085"/>
@@ -745,7 +745,7 @@
           <w:rPr>
             <w:color w:val="285B9D"/>
             <w:u w:val="single"/>
-            <w:rFonts w:eastAsia="Heiti TC" w:ascii="Calibri" w:hAnsi="Calibri"/>
+            <w:rFonts w:eastAsia="Songti SC" w:ascii="Calibri" w:hAnsi="Calibri"/>
           </w:rPr>
           <w:t>reports/archive-9906cc6fde45</w:t>
         </w:r>
@@ -757,13 +757,13 @@
       </w:pPr>
       <w:r>
         <w:rPr>
-          <w:rFonts w:ascii="Calibri" w:hAnsi="Calibri" w:eastAsia="Heiti TC"/>
+          <w:rFonts w:ascii="Calibri" w:hAnsi="Calibri" w:eastAsia="Songti SC"/>
           <w:b/>
           <w:i w:val="0"/>
           <w:color w:val="0B2545"/>
           <w:sz w:val="23"/>
         </w:rPr>
-        <w:t>2. 全球取向硅钢 (GOES) 供应弹性与变压器产业链利润杠杆评估</w:t>
+        <w:t>2. 电网互联与变压器交付瓶颈：压力测试 2026–2028 年 AI 算力电力扩张的物理极限</w:t>
       </w:r>
     </w:p>
     <w:p>
@@ -772,7 +772,77 @@
       </w:pPr>
       <w:r>
         <w:rPr>
-          <w:rFonts w:ascii="Calibri" w:hAnsi="Calibri" w:eastAsia="Heiti TC"/>
+          <w:rFonts w:ascii="Calibri" w:hAnsi="Calibri" w:eastAsia="Songti SC"/>
+          <w:b w:val="0"/>
+          <w:i w:val="0"/>
+          <w:color w:val="667085"/>
+          <w:sz w:val="17"/>
+        </w:rPr>
+        <w:t>未识别 · 电力与电网 · score 56.2</w:t>
+      </w:r>
+    </w:p>
+    <w:p>
+      <w:pPr>
+        <w:spacing w:before="0" w:after="100" w:line="264" w:lineRule="auto"/>
+      </w:pPr>
+      <w:r>
+        <w:rPr>
+          <w:rFonts w:ascii="Calibri" w:hAnsi="Calibri" w:eastAsia="Songti SC"/>
+          <w:b w:val="0"/>
+          <w:i w:val="0"/>
+          <w:color w:val="334155"/>
+          <w:sz w:val="20"/>
+        </w:rPr>
+        <w:t>电网互联与变压器交付瓶颈：压力测试 2026–2028 年 AI 算力电力扩张的物理极限</w:t>
+      </w:r>
+    </w:p>
+    <w:p>
+      <w:pPr>
+        <w:spacing w:before="0" w:after="160" w:line="264" w:lineRule="auto"/>
+      </w:pPr>
+      <w:r>
+        <w:rPr>
+          <w:rFonts w:ascii="Calibri" w:hAnsi="Calibri" w:eastAsia="Songti SC"/>
+          <w:b w:val="0"/>
+          <w:i w:val="0"/>
+          <w:color w:val="667085"/>
+          <w:sz w:val="17"/>
+        </w:rPr>
+        <w:t xml:space="preserve">Report: </w:t>
+      </w:r>
+      <w:hyperlink r:id="rId19">
+        <w:r>
+          <w:rPr>
+            <w:color w:val="285B9D"/>
+            <w:u w:val="single"/>
+            <w:rFonts w:eastAsia="Songti SC" w:ascii="Calibri" w:hAnsi="Calibri"/>
+          </w:rPr>
+          <w:t>reports/archive-e6af345a3ea9</w:t>
+        </w:r>
+      </w:hyperlink>
+    </w:p>
+    <w:p>
+      <w:pPr>
+        <w:spacing w:before="0" w:after="40" w:line="264" w:lineRule="auto"/>
+      </w:pPr>
+      <w:r>
+        <w:rPr>
+          <w:rFonts w:ascii="Calibri" w:hAnsi="Calibri" w:eastAsia="Songti SC"/>
+          <w:b/>
+          <w:i w:val="0"/>
+          <w:color w:val="0B2545"/>
+          <w:sz w:val="23"/>
+        </w:rPr>
+        <w:t>3. 全球取向硅钢 (GOES) 供应弹性与变压器产业链利润杠杆评估</w:t>
+      </w:r>
+    </w:p>
+    <w:p>
+      <w:pPr>
+        <w:spacing w:before="0" w:after="40" w:line="264" w:lineRule="auto"/>
+      </w:pPr>
+      <w:r>
+        <w:rPr>
+          <w:rFonts w:ascii="Calibri" w:hAnsi="Calibri" w:eastAsia="Songti SC"/>
           <w:b w:val="0"/>
           <w:i w:val="0"/>
           <w:color w:val="667085"/>
@@ -787,7 +857,7 @@
       </w:pPr>
       <w:r>
         <w:rPr>
-          <w:rFonts w:ascii="Calibri" w:hAnsi="Calibri" w:eastAsia="Heiti TC"/>
+          <w:rFonts w:ascii="Calibri" w:hAnsi="Calibri" w:eastAsia="Songti SC"/>
           <w:b w:val="0"/>
           <w:i w:val="0"/>
           <w:color w:val="334155"/>
@@ -802,7 +872,7 @@
       </w:pPr>
       <w:r>
         <w:rPr>
-          <w:rFonts w:ascii="Calibri" w:hAnsi="Calibri" w:eastAsia="Heiti TC"/>
+          <w:rFonts w:ascii="Calibri" w:hAnsi="Calibri" w:eastAsia="Songti SC"/>
           <w:b w:val="0"/>
           <w:i w:val="0"/>
           <w:color w:val="667085"/>
@@ -810,12 +880,12 @@
         </w:rPr>
         <w:t xml:space="preserve">Report: </w:t>
       </w:r>
-      <w:hyperlink r:id="rId19">
+      <w:hyperlink r:id="rId20">
         <w:r>
           <w:rPr>
             <w:color w:val="285B9D"/>
             <w:u w:val="single"/>
-            <w:rFonts w:eastAsia="Heiti TC" w:ascii="Calibri" w:hAnsi="Calibri"/>
+            <w:rFonts w:eastAsia="Songti SC" w:ascii="Calibri" w:hAnsi="Calibri"/>
           </w:rPr>
           <w:t>reports/archive-1a4b2ba30aef</w:t>
         </w:r>
@@ -827,13 +897,13 @@
       </w:pPr>
       <w:r>
         <w:rPr>
-          <w:rFonts w:ascii="Calibri" w:hAnsi="Calibri" w:eastAsia="Heiti TC"/>
+          <w:rFonts w:ascii="Calibri" w:hAnsi="Calibri" w:eastAsia="Songti SC"/>
           <w:b/>
           <w:i w:val="0"/>
           <w:color w:val="0B2545"/>
           <w:sz w:val="23"/>
         </w:rPr>
-        <w:t>3. prior research notes· 半导体分析师研究报告</w:t>
+        <w:t>4. prior research notes· 半导体分析师研究报告</w:t>
       </w:r>
     </w:p>
     <w:p>
@@ -842,7 +912,7 @@
       </w:pPr>
       <w:r>
         <w:rPr>
-          <w:rFonts w:ascii="Calibri" w:hAnsi="Calibri" w:eastAsia="Heiti TC"/>
+          <w:rFonts w:ascii="Calibri" w:hAnsi="Calibri" w:eastAsia="Songti SC"/>
           <w:b w:val="0"/>
           <w:i w:val="0"/>
           <w:color w:val="667085"/>
@@ -857,7 +927,7 @@
       </w:pPr>
       <w:r>
         <w:rPr>
-          <w:rFonts w:ascii="Calibri" w:hAnsi="Calibri" w:eastAsia="Heiti TC"/>
+          <w:rFonts w:ascii="Calibri" w:hAnsi="Calibri" w:eastAsia="Songti SC"/>
           <w:b w:val="0"/>
           <w:i w:val="0"/>
           <w:color w:val="334155"/>
@@ -872,7 +942,7 @@
       </w:pPr>
       <w:r>
         <w:rPr>
-          <w:rFonts w:ascii="Calibri" w:hAnsi="Calibri" w:eastAsia="Heiti TC"/>
+          <w:rFonts w:ascii="Calibri" w:hAnsi="Calibri" w:eastAsia="Songti SC"/>
           <w:b w:val="0"/>
           <w:i w:val="0"/>
           <w:color w:val="667085"/>
@@ -880,12 +950,12 @@
         </w:rPr>
         <w:t xml:space="preserve">Report: </w:t>
       </w:r>
-      <w:hyperlink r:id="rId20">
+      <w:hyperlink r:id="rId21">
         <w:r>
           <w:rPr>
             <w:color w:val="285B9D"/>
             <w:u w:val="single"/>
-            <w:rFonts w:eastAsia="Heiti TC" w:ascii="Calibri" w:hAnsi="Calibri"/>
+            <w:rFonts w:eastAsia="Songti SC" w:ascii="Calibri" w:hAnsi="Calibri"/>
           </w:rPr>
           <w:t>reports/archive-8c9df85b29e8</w:t>
         </w:r>
@@ -897,13 +967,13 @@
       </w:pPr>
       <w:r>
         <w:rPr>
-          <w:rFonts w:ascii="Calibri" w:hAnsi="Calibri" w:eastAsia="Heiti TC"/>
+          <w:rFonts w:ascii="Calibri" w:hAnsi="Calibri" w:eastAsia="Songti SC"/>
           <w:b/>
           <w:i w:val="0"/>
           <w:color w:val="0B2545"/>
           <w:sz w:val="23"/>
         </w:rPr>
-        <w:t>4. 2026-06-18 压力测试：AI 算力经济学——能源成本、TCO 结构，及其对芯片与设备 capex 效率的反向...</w:t>
+        <w:t>5. 2026-06-18 压力测试：AI 算力经济学——能源成本、TCO 结构，及其对芯片与设备 capex 效率的反向...</w:t>
       </w:r>
     </w:p>
     <w:p>
@@ -912,7 +982,7 @@
       </w:pPr>
       <w:r>
         <w:rPr>
-          <w:rFonts w:ascii="Calibri" w:hAnsi="Calibri" w:eastAsia="Heiti TC"/>
+          <w:rFonts w:ascii="Calibri" w:hAnsi="Calibri" w:eastAsia="Songti SC"/>
           <w:b w:val="0"/>
           <w:i w:val="0"/>
           <w:color w:val="667085"/>
@@ -927,7 +997,7 @@
       </w:pPr>
       <w:r>
         <w:rPr>
-          <w:rFonts w:ascii="Calibri" w:hAnsi="Calibri" w:eastAsia="Heiti TC"/>
+          <w:rFonts w:ascii="Calibri" w:hAnsi="Calibri" w:eastAsia="Songti SC"/>
           <w:b w:val="0"/>
           <w:i w:val="0"/>
           <w:color w:val="334155"/>
@@ -942,7 +1012,7 @@
       </w:pPr>
       <w:r>
         <w:rPr>
-          <w:rFonts w:ascii="Calibri" w:hAnsi="Calibri" w:eastAsia="Heiti TC"/>
+          <w:rFonts w:ascii="Calibri" w:hAnsi="Calibri" w:eastAsia="Songti SC"/>
           <w:b w:val="0"/>
           <w:i w:val="0"/>
           <w:color w:val="667085"/>
@@ -950,12 +1020,12 @@
         </w:rPr>
         <w:t xml:space="preserve">Report: </w:t>
       </w:r>
-      <w:hyperlink r:id="rId21">
+      <w:hyperlink r:id="rId22">
         <w:r>
           <w:rPr>
             <w:color w:val="285B9D"/>
             <w:u w:val="single"/>
-            <w:rFonts w:eastAsia="Heiti TC" w:ascii="Calibri" w:hAnsi="Calibri"/>
+            <w:rFonts w:eastAsia="Songti SC" w:ascii="Calibri" w:hAnsi="Calibri"/>
           </w:rPr>
           <w:t>reports/archive-ff9ba4318e3f</w:t>
         </w:r>
@@ -967,13 +1037,13 @@
       </w:pPr>
       <w:r>
         <w:rPr>
-          <w:rFonts w:ascii="Calibri" w:hAnsi="Calibri" w:eastAsia="Heiti TC"/>
+          <w:rFonts w:ascii="Calibri" w:hAnsi="Calibri" w:eastAsia="Songti SC"/>
           <w:b/>
           <w:i w:val="0"/>
           <w:color w:val="0B2545"/>
           <w:sz w:val="23"/>
         </w:rPr>
-        <w:t>5. AIDD 需求驱动下的先进封装与 HBM 硬件规格演进</w:t>
+        <w:t>6. AIDD 需求驱动下的先进封装与 HBM 硬件规格演进</w:t>
       </w:r>
     </w:p>
     <w:p>
@@ -982,7 +1052,7 @@
       </w:pPr>
       <w:r>
         <w:rPr>
-          <w:rFonts w:ascii="Calibri" w:hAnsi="Calibri" w:eastAsia="Heiti TC"/>
+          <w:rFonts w:ascii="Calibri" w:hAnsi="Calibri" w:eastAsia="Songti SC"/>
           <w:b w:val="0"/>
           <w:i w:val="0"/>
           <w:color w:val="667085"/>
@@ -997,7 +1067,7 @@
       </w:pPr>
       <w:r>
         <w:rPr>
-          <w:rFonts w:ascii="Calibri" w:hAnsi="Calibri" w:eastAsia="Heiti TC"/>
+          <w:rFonts w:ascii="Calibri" w:hAnsi="Calibri" w:eastAsia="Songti SC"/>
           <w:b w:val="0"/>
           <w:i w:val="0"/>
           <w:color w:val="334155"/>
@@ -1012,77 +1082,7 @@
       </w:pPr>
       <w:r>
         <w:rPr>
-          <w:rFonts w:ascii="Calibri" w:hAnsi="Calibri" w:eastAsia="Heiti TC"/>
-          <w:b w:val="0"/>
-          <w:i w:val="0"/>
-          <w:color w:val="667085"/>
-          <w:sz w:val="17"/>
-        </w:rPr>
-        <w:t xml:space="preserve">Report: </w:t>
-      </w:r>
-      <w:hyperlink r:id="rId22">
-        <w:r>
-          <w:rPr>
-            <w:color w:val="285B9D"/>
-            <w:u w:val="single"/>
-            <w:rFonts w:eastAsia="Heiti TC" w:ascii="Calibri" w:hAnsi="Calibri"/>
-          </w:rPr>
-          <w:t>reports/archive-055460301258</w:t>
-        </w:r>
-      </w:hyperlink>
-    </w:p>
-    <w:p>
-      <w:pPr>
-        <w:spacing w:before="0" w:after="40" w:line="264" w:lineRule="auto"/>
-      </w:pPr>
-      <w:r>
-        <w:rPr>
-          <w:rFonts w:ascii="Calibri" w:hAnsi="Calibri" w:eastAsia="Heiti TC"/>
-          <w:b/>
-          <w:i w:val="0"/>
-          <w:color w:val="0B2545"/>
-          <w:sz w:val="23"/>
-        </w:rPr>
-        <w:t>6. 西方电力设备巨头（GE, Siemens, Hitachi）的产能释放与订单错配压力评估：对电网瓶颈的压力测试</w:t>
-      </w:r>
-    </w:p>
-    <w:p>
-      <w:pPr>
-        <w:spacing w:before="0" w:after="40" w:line="264" w:lineRule="auto"/>
-      </w:pPr>
-      <w:r>
-        <w:rPr>
-          <w:rFonts w:ascii="Calibri" w:hAnsi="Calibri" w:eastAsia="Heiti TC"/>
-          <w:b w:val="0"/>
-          <w:i w:val="0"/>
-          <w:color w:val="667085"/>
-          <w:sz w:val="17"/>
-        </w:rPr>
-        <w:t>未识别 · 电力与电网 · score 49.8</w:t>
-      </w:r>
-    </w:p>
-    <w:p>
-      <w:pPr>
-        <w:spacing w:before="0" w:after="100" w:line="264" w:lineRule="auto"/>
-      </w:pPr>
-      <w:r>
-        <w:rPr>
-          <w:rFonts w:ascii="Calibri" w:hAnsi="Calibri" w:eastAsia="Heiti TC"/>
-          <w:b w:val="0"/>
-          <w:i w:val="0"/>
-          <w:color w:val="334155"/>
-          <w:sz w:val="20"/>
-        </w:rPr>
-        <w:t>西方电力设备巨头（GE, Siemens, Hitachi）的产能释放与订单错配压力评估：对电网瓶颈的压力测试</w:t>
-      </w:r>
-    </w:p>
-    <w:p>
-      <w:pPr>
-        <w:spacing w:before="0" w:after="160" w:line="264" w:lineRule="auto"/>
-      </w:pPr>
-      <w:r>
-        <w:rPr>
-          <w:rFonts w:ascii="Calibri" w:hAnsi="Calibri" w:eastAsia="Heiti TC"/>
+          <w:rFonts w:ascii="Calibri" w:hAnsi="Calibri" w:eastAsia="Songti SC"/>
           <w:b w:val="0"/>
           <w:i w:val="0"/>
           <w:color w:val="667085"/>
@@ -1095,9 +1095,9 @@
           <w:rPr>
             <w:color w:val="285B9D"/>
             <w:u w:val="single"/>
-            <w:rFonts w:eastAsia="Heiti TC" w:ascii="Calibri" w:hAnsi="Calibri"/>
+            <w:rFonts w:eastAsia="Songti SC" w:ascii="Calibri" w:hAnsi="Calibri"/>
           </w:rPr>
-          <w:t>reports/archive-53964ab22290</w:t>
+          <w:t>reports/archive-055460301258</w:t>
         </w:r>
       </w:hyperlink>
     </w:p>
@@ -1115,7 +1115,7 @@
       </w:pPr>
       <w:r>
         <w:rPr>
-          <w:rFonts w:ascii="Calibri" w:hAnsi="Calibri" w:eastAsia="Heiti TC"/>
+          <w:rFonts w:ascii="Calibri" w:hAnsi="Calibri" w:eastAsia="Songti SC"/>
           <w:b/>
           <w:i w:val="0"/>
           <w:color w:val="0B2545"/>
@@ -1130,7 +1130,7 @@
       </w:pPr>
       <w:r>
         <w:rPr>
-          <w:rFonts w:ascii="Calibri" w:hAnsi="Calibri" w:eastAsia="Heiti TC"/>
+          <w:rFonts w:ascii="Calibri" w:hAnsi="Calibri" w:eastAsia="Songti SC"/>
           <w:b w:val="0"/>
           <w:i w:val="0"/>
           <w:color w:val="334155"/>
@@ -1145,7 +1145,7 @@
       </w:pPr>
       <w:r>
         <w:rPr>
-          <w:rFonts w:ascii="Calibri" w:hAnsi="Calibri" w:eastAsia="Heiti TC"/>
+          <w:rFonts w:ascii="Calibri" w:hAnsi="Calibri" w:eastAsia="Songti SC"/>
           <w:b w:val="0"/>
           <w:i w:val="0"/>
           <w:color w:val="667085"/>
@@ -1158,7 +1158,7 @@
           <w:rPr>
             <w:color w:val="285B9D"/>
             <w:u w:val="single"/>
-            <w:rFonts w:eastAsia="Heiti TC" w:ascii="Calibri" w:hAnsi="Calibri"/>
+            <w:rFonts w:eastAsia="Songti SC" w:ascii="Calibri" w:hAnsi="Calibri"/>
           </w:rPr>
           <w:t>reports/archive-6984a39e382c</w:t>
         </w:r>
@@ -1170,7 +1170,7 @@
       </w:pPr>
       <w:r>
         <w:rPr>
-          <w:rFonts w:ascii="Calibri" w:hAnsi="Calibri" w:eastAsia="Heiti TC"/>
+          <w:rFonts w:ascii="Calibri" w:hAnsi="Calibri" w:eastAsia="Songti SC"/>
           <w:b/>
           <w:i w:val="0"/>
           <w:color w:val="0B2545"/>
@@ -1185,7 +1185,7 @@
       </w:pPr>
       <w:r>
         <w:rPr>
-          <w:rFonts w:ascii="Calibri" w:hAnsi="Calibri" w:eastAsia="Heiti TC"/>
+          <w:rFonts w:ascii="Calibri" w:hAnsi="Calibri" w:eastAsia="Songti SC"/>
           <w:b w:val="0"/>
           <w:i w:val="0"/>
           <w:color w:val="334155"/>
@@ -1200,7 +1200,7 @@
       </w:pPr>
       <w:r>
         <w:rPr>
-          <w:rFonts w:ascii="Calibri" w:hAnsi="Calibri" w:eastAsia="Heiti TC"/>
+          <w:rFonts w:ascii="Calibri" w:hAnsi="Calibri" w:eastAsia="Songti SC"/>
           <w:b w:val="0"/>
           <w:i w:val="0"/>
           <w:color w:val="667085"/>
@@ -1213,7 +1213,7 @@
           <w:rPr>
             <w:color w:val="285B9D"/>
             <w:u w:val="single"/>
-            <w:rFonts w:eastAsia="Heiti TC" w:ascii="Calibri" w:hAnsi="Calibri"/>
+            <w:rFonts w:eastAsia="Songti SC" w:ascii="Calibri" w:hAnsi="Calibri"/>
           </w:rPr>
           <w:t>reports/archive-9906cc6fde45</w:t>
         </w:r>
@@ -1225,7 +1225,7 @@
       </w:pPr>
       <w:r>
         <w:rPr>
-          <w:rFonts w:ascii="Calibri" w:hAnsi="Calibri" w:eastAsia="Heiti TC"/>
+          <w:rFonts w:ascii="Calibri" w:hAnsi="Calibri" w:eastAsia="Songti SC"/>
           <w:b/>
           <w:i w:val="0"/>
           <w:color w:val="0B2545"/>
@@ -1240,7 +1240,7 @@
       </w:pPr>
       <w:r>
         <w:rPr>
-          <w:rFonts w:ascii="Calibri" w:hAnsi="Calibri" w:eastAsia="Heiti TC"/>
+          <w:rFonts w:ascii="Calibri" w:hAnsi="Calibri" w:eastAsia="Songti SC"/>
           <w:b w:val="0"/>
           <w:i w:val="0"/>
           <w:color w:val="334155"/>
@@ -1255,7 +1255,7 @@
       </w:pPr>
       <w:r>
         <w:rPr>
-          <w:rFonts w:ascii="Calibri" w:hAnsi="Calibri" w:eastAsia="Heiti TC"/>
+          <w:rFonts w:ascii="Calibri" w:hAnsi="Calibri" w:eastAsia="Songti SC"/>
           <w:b w:val="0"/>
           <w:i w:val="0"/>
           <w:color w:val="667085"/>
@@ -1268,7 +1268,7 @@
           <w:rPr>
             <w:color w:val="285B9D"/>
             <w:u w:val="single"/>
-            <w:rFonts w:eastAsia="Heiti TC" w:ascii="Calibri" w:hAnsi="Calibri"/>
+            <w:rFonts w:eastAsia="Songti SC" w:ascii="Calibri" w:hAnsi="Calibri"/>
           </w:rPr>
           <w:t>reports/archive-6921ecb4fc86</w:t>
         </w:r>
@@ -1311,7 +1311,7 @@
             <w:r/>
             <w:r>
               <w:rPr>
-                <w:rFonts w:ascii="Calibri" w:hAnsi="Calibri" w:eastAsia="Heiti TC"/>
+                <w:rFonts w:ascii="Calibri" w:hAnsi="Calibri" w:eastAsia="Songti SC"/>
                 <w:b/>
                 <w:color w:val="475569"/>
                 <w:sz w:val="18"/>
@@ -1334,7 +1334,7 @@
             <w:r/>
             <w:r>
               <w:rPr>
-                <w:rFonts w:ascii="Calibri" w:hAnsi="Calibri" w:eastAsia="Heiti TC"/>
+                <w:rFonts w:ascii="Calibri" w:hAnsi="Calibri" w:eastAsia="Songti SC"/>
                 <w:b/>
                 <w:color w:val="475569"/>
                 <w:sz w:val="18"/>
@@ -1357,7 +1357,7 @@
             <w:r/>
             <w:r>
               <w:rPr>
-                <w:rFonts w:ascii="Calibri" w:hAnsi="Calibri" w:eastAsia="Heiti TC"/>
+                <w:rFonts w:ascii="Calibri" w:hAnsi="Calibri" w:eastAsia="Songti SC"/>
                 <w:b/>
                 <w:color w:val="475569"/>
                 <w:sz w:val="18"/>
@@ -1380,7 +1380,7 @@
             <w:r/>
             <w:r>
               <w:rPr>
-                <w:rFonts w:ascii="Calibri" w:hAnsi="Calibri" w:eastAsia="Heiti TC"/>
+                <w:rFonts w:ascii="Calibri" w:hAnsi="Calibri" w:eastAsia="Songti SC"/>
                 <w:b/>
                 <w:color w:val="475569"/>
                 <w:sz w:val="18"/>
@@ -1403,7 +1403,7 @@
             <w:r/>
             <w:r>
               <w:rPr>
-                <w:rFonts w:ascii="Calibri" w:hAnsi="Calibri" w:eastAsia="Heiti TC"/>
+                <w:rFonts w:ascii="Calibri" w:hAnsi="Calibri" w:eastAsia="Songti SC"/>
                 <w:b/>
                 <w:color w:val="475569"/>
                 <w:sz w:val="18"/>
@@ -1426,7 +1426,7 @@
             <w:r/>
             <w:r>
               <w:rPr>
-                <w:rFonts w:ascii="Calibri" w:hAnsi="Calibri" w:eastAsia="Heiti TC"/>
+                <w:rFonts w:ascii="Calibri" w:hAnsi="Calibri" w:eastAsia="Songti SC"/>
                 <w:b w:val="0"/>
                 <w:color w:val="111827"/>
                 <w:sz w:val="17"/>
@@ -1447,7 +1447,7 @@
             <w:r/>
             <w:r>
               <w:rPr>
-                <w:rFonts w:ascii="Calibri" w:hAnsi="Calibri" w:eastAsia="Heiti TC"/>
+                <w:rFonts w:ascii="Calibri" w:hAnsi="Calibri" w:eastAsia="Songti SC"/>
                 <w:b w:val="0"/>
                 <w:color w:val="111827"/>
                 <w:sz w:val="16"/>
@@ -1468,7 +1468,7 @@
             <w:r/>
             <w:r>
               <w:rPr>
-                <w:rFonts w:ascii="Calibri" w:hAnsi="Calibri" w:eastAsia="Heiti TC"/>
+                <w:rFonts w:ascii="Calibri" w:hAnsi="Calibri" w:eastAsia="Songti SC"/>
                 <w:b w:val="0"/>
                 <w:color w:val="111827"/>
                 <w:sz w:val="16"/>
@@ -1490,7 +1490,7 @@
             <w:r/>
             <w:r>
               <w:rPr>
-                <w:rFonts w:ascii="Calibri" w:hAnsi="Calibri" w:eastAsia="Heiti TC"/>
+                <w:rFonts w:ascii="Calibri" w:hAnsi="Calibri" w:eastAsia="Songti SC"/>
                 <w:b/>
                 <w:color w:val="111827"/>
                 <w:sz w:val="17"/>
@@ -1512,7 +1512,7 @@
             <w:r/>
             <w:r>
               <w:rPr>
-                <w:rFonts w:ascii="Calibri" w:hAnsi="Calibri" w:eastAsia="Heiti TC"/>
+                <w:rFonts w:ascii="Calibri" w:hAnsi="Calibri" w:eastAsia="Songti SC"/>
                 <w:b w:val="0"/>
                 <w:color w:val="111827"/>
                 <w:sz w:val="16"/>
@@ -1535,7 +1535,116 @@
             <w:r/>
             <w:r>
               <w:rPr>
-                <w:rFonts w:ascii="Calibri" w:hAnsi="Calibri" w:eastAsia="Heiti TC"/>
+                <w:rFonts w:ascii="Calibri" w:hAnsi="Calibri" w:eastAsia="Songti SC"/>
+                <w:b w:val="0"/>
+                <w:color w:val="111827"/>
+                <w:sz w:val="17"/>
+              </w:rPr>
+              <w:t>电网互联与变压器交付瓶颈：压力测试 2026–2028 年 AI 算力电力扩张的物理极限</w:t>
+            </w:r>
+          </w:p>
+        </w:tc>
+        <w:tc>
+          <w:tcPr>
+            <w:tcW w:type="dxa" w:w="1560"/>
+            <w:vAlign w:val="center"/>
+          </w:tcPr>
+          <w:p>
+            <w:pPr>
+              <w:spacing w:before="0" w:after="0"/>
+            </w:pPr>
+            <w:r/>
+            <w:r>
+              <w:rPr>
+                <w:rFonts w:ascii="Calibri" w:hAnsi="Calibri" w:eastAsia="Songti SC"/>
+                <w:b w:val="0"/>
+                <w:color w:val="111827"/>
+                <w:sz w:val="16"/>
+              </w:rPr>
+              <w:t>未识别</w:t>
+            </w:r>
+          </w:p>
+        </w:tc>
+        <w:tc>
+          <w:tcPr>
+            <w:tcW w:type="dxa" w:w="1680"/>
+            <w:vAlign w:val="center"/>
+          </w:tcPr>
+          <w:p>
+            <w:pPr>
+              <w:spacing w:before="0" w:after="0"/>
+            </w:pPr>
+            <w:r/>
+            <w:r>
+              <w:rPr>
+                <w:rFonts w:ascii="Calibri" w:hAnsi="Calibri" w:eastAsia="Songti SC"/>
+                <w:b w:val="0"/>
+                <w:color w:val="111827"/>
+                <w:sz w:val="16"/>
+              </w:rPr>
+              <w:t>电力与电网</w:t>
+            </w:r>
+          </w:p>
+        </w:tc>
+        <w:tc>
+          <w:tcPr>
+            <w:tcW w:type="dxa" w:w="900"/>
+            <w:vAlign w:val="center"/>
+          </w:tcPr>
+          <w:p>
+            <w:pPr>
+              <w:spacing w:before="0" w:after="0"/>
+              <w:jc w:val="center"/>
+            </w:pPr>
+            <w:r/>
+            <w:r>
+              <w:rPr>
+                <w:rFonts w:ascii="Calibri" w:hAnsi="Calibri" w:eastAsia="Songti SC"/>
+                <w:b/>
+                <w:color w:val="111827"/>
+                <w:sz w:val="17"/>
+              </w:rPr>
+              <w:t>56.2</w:t>
+            </w:r>
+          </w:p>
+        </w:tc>
+        <w:tc>
+          <w:tcPr>
+            <w:tcW w:type="dxa" w:w="1500"/>
+            <w:vAlign w:val="center"/>
+          </w:tcPr>
+          <w:p>
+            <w:pPr>
+              <w:spacing w:before="0" w:after="0"/>
+              <w:jc w:val="center"/>
+            </w:pPr>
+            <w:r/>
+            <w:r>
+              <w:rPr>
+                <w:rFonts w:ascii="Calibri" w:hAnsi="Calibri" w:eastAsia="Songti SC"/>
+                <w:b w:val="0"/>
+                <w:color w:val="111827"/>
+                <w:sz w:val="16"/>
+              </w:rPr>
+              <w:t>风险 3</w:t>
+            </w:r>
+          </w:p>
+        </w:tc>
+      </w:tr>
+      <w:tr>
+        <w:tc>
+          <w:tcPr>
+            <w:tcW w:type="dxa" w:w="3720"/>
+            <w:vAlign w:val="center"/>
+          </w:tcPr>
+          <w:p>
+            <w:pPr>
+              <w:spacing w:before="0" w:after="0"/>
+            </w:pPr>
+            <w:r/>
+            <w:r>
+              <w:rPr>
+                <w:rFonts w:ascii="Calibri" w:hAnsi="Calibri" w:eastAsia="Songti SC"/>
                 <w:b w:val="0"/>
                 <w:color w:val="111827"/>
                 <w:sz w:val="17"/>
@@ -1556,7 +1665,7 @@
             <w:r/>
             <w:r>
               <w:rPr>
-                <w:rFonts w:ascii="Calibri" w:hAnsi="Calibri" w:eastAsia="Heiti TC"/>
+                <w:rFonts w:ascii="Calibri" w:hAnsi="Calibri" w:eastAsia="Songti SC"/>
                 <w:b w:val="0"/>
                 <w:color w:val="111827"/>
                 <w:sz w:val="16"/>
@@ -1577,7 +1686,7 @@
             <w:r/>
             <w:r>
               <w:rPr>
-                <w:rFonts w:ascii="Calibri" w:hAnsi="Calibri" w:eastAsia="Heiti TC"/>
+                <w:rFonts w:ascii="Calibri" w:hAnsi="Calibri" w:eastAsia="Songti SC"/>
                 <w:b w:val="0"/>
                 <w:color w:val="111827"/>
                 <w:sz w:val="16"/>
@@ -1599,7 +1708,7 @@
             <w:r/>
             <w:r>
               <w:rPr>
-                <w:rFonts w:ascii="Calibri" w:hAnsi="Calibri" w:eastAsia="Heiti TC"/>
+                <w:rFonts w:ascii="Calibri" w:hAnsi="Calibri" w:eastAsia="Songti SC"/>
                 <w:b/>
                 <w:color w:val="111827"/>
                 <w:sz w:val="17"/>
@@ -1621,7 +1730,7 @@
             <w:r/>
             <w:r>
               <w:rPr>
-                <w:rFonts w:ascii="Calibri" w:hAnsi="Calibri" w:eastAsia="Heiti TC"/>
+                <w:rFonts w:ascii="Calibri" w:hAnsi="Calibri" w:eastAsia="Songti SC"/>
                 <w:b w:val="0"/>
                 <w:color w:val="111827"/>
                 <w:sz w:val="16"/>
@@ -1644,7 +1753,7 @@
             <w:r/>
             <w:r>
               <w:rPr>
-                <w:rFonts w:ascii="Calibri" w:hAnsi="Calibri" w:eastAsia="Heiti TC"/>
+                <w:rFonts w:ascii="Calibri" w:hAnsi="Calibri" w:eastAsia="Songti SC"/>
                 <w:b w:val="0"/>
                 <w:color w:val="111827"/>
                 <w:sz w:val="17"/>
@@ -1665,7 +1774,7 @@
             <w:r/>
             <w:r>
               <w:rPr>
-                <w:rFonts w:ascii="Calibri" w:hAnsi="Calibri" w:eastAsia="Heiti TC"/>
+                <w:rFonts w:ascii="Calibri" w:hAnsi="Calibri" w:eastAsia="Songti SC"/>
                 <w:b w:val="0"/>
                 <w:color w:val="111827"/>
                 <w:sz w:val="16"/>
@@ -1686,7 +1795,7 @@
             <w:r/>
             <w:r>
               <w:rPr>
-                <w:rFonts w:ascii="Calibri" w:hAnsi="Calibri" w:eastAsia="Heiti TC"/>
+                <w:rFonts w:ascii="Calibri" w:hAnsi="Calibri" w:eastAsia="Songti SC"/>
                 <w:b w:val="0"/>
                 <w:color w:val="111827"/>
                 <w:sz w:val="16"/>
@@ -1708,7 +1817,7 @@
             <w:r/>
             <w:r>
               <w:rPr>
-                <w:rFonts w:ascii="Calibri" w:hAnsi="Calibri" w:eastAsia="Heiti TC"/>
+                <w:rFonts w:ascii="Calibri" w:hAnsi="Calibri" w:eastAsia="Songti SC"/>
                 <w:b/>
                 <w:color w:val="111827"/>
                 <w:sz w:val="17"/>
@@ -1730,7 +1839,7 @@
             <w:r/>
             <w:r>
               <w:rPr>
-                <w:rFonts w:ascii="Calibri" w:hAnsi="Calibri" w:eastAsia="Heiti TC"/>
+                <w:rFonts w:ascii="Calibri" w:hAnsi="Calibri" w:eastAsia="Songti SC"/>
                 <w:b w:val="0"/>
                 <w:color w:val="111827"/>
                 <w:sz w:val="16"/>
@@ -1753,7 +1862,7 @@
             <w:r/>
             <w:r>
               <w:rPr>
-                <w:rFonts w:ascii="Calibri" w:hAnsi="Calibri" w:eastAsia="Heiti TC"/>
+                <w:rFonts w:ascii="Calibri" w:hAnsi="Calibri" w:eastAsia="Songti SC"/>
                 <w:b w:val="0"/>
                 <w:color w:val="111827"/>
                 <w:sz w:val="17"/>
@@ -1774,7 +1883,7 @@
             <w:r/>
             <w:r>
               <w:rPr>
-                <w:rFonts w:ascii="Calibri" w:hAnsi="Calibri" w:eastAsia="Heiti TC"/>
+                <w:rFonts w:ascii="Calibri" w:hAnsi="Calibri" w:eastAsia="Songti SC"/>
                 <w:b w:val="0"/>
                 <w:color w:val="111827"/>
                 <w:sz w:val="16"/>
@@ -1795,7 +1904,7 @@
             <w:r/>
             <w:r>
               <w:rPr>
-                <w:rFonts w:ascii="Calibri" w:hAnsi="Calibri" w:eastAsia="Heiti TC"/>
+                <w:rFonts w:ascii="Calibri" w:hAnsi="Calibri" w:eastAsia="Songti SC"/>
                 <w:b w:val="0"/>
                 <w:color w:val="111827"/>
                 <w:sz w:val="16"/>
@@ -1817,7 +1926,7 @@
             <w:r/>
             <w:r>
               <w:rPr>
-                <w:rFonts w:ascii="Calibri" w:hAnsi="Calibri" w:eastAsia="Heiti TC"/>
+                <w:rFonts w:ascii="Calibri" w:hAnsi="Calibri" w:eastAsia="Songti SC"/>
                 <w:b/>
                 <w:color w:val="111827"/>
                 <w:sz w:val="17"/>
@@ -1839,7 +1948,7 @@
             <w:r/>
             <w:r>
               <w:rPr>
-                <w:rFonts w:ascii="Calibri" w:hAnsi="Calibri" w:eastAsia="Heiti TC"/>
+                <w:rFonts w:ascii="Calibri" w:hAnsi="Calibri" w:eastAsia="Songti SC"/>
                 <w:b w:val="0"/>
                 <w:color w:val="111827"/>
                 <w:sz w:val="16"/>
@@ -1862,7 +1971,7 @@
             <w:r/>
             <w:r>
               <w:rPr>
-                <w:rFonts w:ascii="Calibri" w:hAnsi="Calibri" w:eastAsia="Heiti TC"/>
+                <w:rFonts w:ascii="Calibri" w:hAnsi="Calibri" w:eastAsia="Songti SC"/>
                 <w:b w:val="0"/>
                 <w:color w:val="111827"/>
                 <w:sz w:val="17"/>
@@ -1883,7 +1992,7 @@
             <w:r/>
             <w:r>
               <w:rPr>
-                <w:rFonts w:ascii="Calibri" w:hAnsi="Calibri" w:eastAsia="Heiti TC"/>
+                <w:rFonts w:ascii="Calibri" w:hAnsi="Calibri" w:eastAsia="Songti SC"/>
                 <w:b w:val="0"/>
                 <w:color w:val="111827"/>
                 <w:sz w:val="16"/>
@@ -1904,7 +2013,7 @@
             <w:r/>
             <w:r>
               <w:rPr>
-                <w:rFonts w:ascii="Calibri" w:hAnsi="Calibri" w:eastAsia="Heiti TC"/>
+                <w:rFonts w:ascii="Calibri" w:hAnsi="Calibri" w:eastAsia="Songti SC"/>
                 <w:b w:val="0"/>
                 <w:color w:val="111827"/>
                 <w:sz w:val="16"/>
@@ -1926,7 +2035,7 @@
             <w:r/>
             <w:r>
               <w:rPr>
-                <w:rFonts w:ascii="Calibri" w:hAnsi="Calibri" w:eastAsia="Heiti TC"/>
+                <w:rFonts w:ascii="Calibri" w:hAnsi="Calibri" w:eastAsia="Songti SC"/>
                 <w:b/>
                 <w:color w:val="111827"/>
                 <w:sz w:val="17"/>
@@ -1948,7 +2057,7 @@
             <w:r/>
             <w:r>
               <w:rPr>
-                <w:rFonts w:ascii="Calibri" w:hAnsi="Calibri" w:eastAsia="Heiti TC"/>
+                <w:rFonts w:ascii="Calibri" w:hAnsi="Calibri" w:eastAsia="Songti SC"/>
                 <w:b w:val="0"/>
                 <w:color w:val="111827"/>
                 <w:sz w:val="16"/>
@@ -1971,7 +2080,7 @@
             <w:r/>
             <w:r>
               <w:rPr>
-                <w:rFonts w:ascii="Calibri" w:hAnsi="Calibri" w:eastAsia="Heiti TC"/>
+                <w:rFonts w:ascii="Calibri" w:hAnsi="Calibri" w:eastAsia="Songti SC"/>
                 <w:b w:val="0"/>
                 <w:color w:val="111827"/>
                 <w:sz w:val="17"/>
@@ -1992,7 +2101,7 @@
             <w:r/>
             <w:r>
               <w:rPr>
-                <w:rFonts w:ascii="Calibri" w:hAnsi="Calibri" w:eastAsia="Heiti TC"/>
+                <w:rFonts w:ascii="Calibri" w:hAnsi="Calibri" w:eastAsia="Songti SC"/>
                 <w:b w:val="0"/>
                 <w:color w:val="111827"/>
                 <w:sz w:val="16"/>
@@ -2013,7 +2122,7 @@
             <w:r/>
             <w:r>
               <w:rPr>
-                <w:rFonts w:ascii="Calibri" w:hAnsi="Calibri" w:eastAsia="Heiti TC"/>
+                <w:rFonts w:ascii="Calibri" w:hAnsi="Calibri" w:eastAsia="Songti SC"/>
                 <w:b w:val="0"/>
                 <w:color w:val="111827"/>
                 <w:sz w:val="16"/>
@@ -2035,7 +2144,7 @@
             <w:r/>
             <w:r>
               <w:rPr>
-                <w:rFonts w:ascii="Calibri" w:hAnsi="Calibri" w:eastAsia="Heiti TC"/>
+                <w:rFonts w:ascii="Calibri" w:hAnsi="Calibri" w:eastAsia="Songti SC"/>
                 <w:b/>
                 <w:color w:val="111827"/>
                 <w:sz w:val="17"/>
@@ -2057,7 +2166,7 @@
             <w:r/>
             <w:r>
               <w:rPr>
-                <w:rFonts w:ascii="Calibri" w:hAnsi="Calibri" w:eastAsia="Heiti TC"/>
+                <w:rFonts w:ascii="Calibri" w:hAnsi="Calibri" w:eastAsia="Songti SC"/>
                 <w:b w:val="0"/>
                 <w:color w:val="111827"/>
                 <w:sz w:val="16"/>
@@ -2080,7 +2189,7 @@
             <w:r/>
             <w:r>
               <w:rPr>
-                <w:rFonts w:ascii="Calibri" w:hAnsi="Calibri" w:eastAsia="Heiti TC"/>
+                <w:rFonts w:ascii="Calibri" w:hAnsi="Calibri" w:eastAsia="Songti SC"/>
                 <w:b w:val="0"/>
                 <w:color w:val="111827"/>
                 <w:sz w:val="17"/>
@@ -2101,7 +2210,7 @@
             <w:r/>
             <w:r>
               <w:rPr>
-                <w:rFonts w:ascii="Calibri" w:hAnsi="Calibri" w:eastAsia="Heiti TC"/>
+                <w:rFonts w:ascii="Calibri" w:hAnsi="Calibri" w:eastAsia="Songti SC"/>
                 <w:b w:val="0"/>
                 <w:color w:val="111827"/>
                 <w:sz w:val="16"/>
@@ -2122,7 +2231,7 @@
             <w:r/>
             <w:r>
               <w:rPr>
-                <w:rFonts w:ascii="Calibri" w:hAnsi="Calibri" w:eastAsia="Heiti TC"/>
+                <w:rFonts w:ascii="Calibri" w:hAnsi="Calibri" w:eastAsia="Songti SC"/>
                 <w:b w:val="0"/>
                 <w:color w:val="111827"/>
                 <w:sz w:val="16"/>
@@ -2144,7 +2253,7 @@
             <w:r/>
             <w:r>
               <w:rPr>
-                <w:rFonts w:ascii="Calibri" w:hAnsi="Calibri" w:eastAsia="Heiti TC"/>
+                <w:rFonts w:ascii="Calibri" w:hAnsi="Calibri" w:eastAsia="Songti SC"/>
                 <w:b/>
                 <w:color w:val="111827"/>
                 <w:sz w:val="17"/>
@@ -2166,7 +2275,7 @@
             <w:r/>
             <w:r>
               <w:rPr>
-                <w:rFonts w:ascii="Calibri" w:hAnsi="Calibri" w:eastAsia="Heiti TC"/>
+                <w:rFonts w:ascii="Calibri" w:hAnsi="Calibri" w:eastAsia="Songti SC"/>
                 <w:b w:val="0"/>
                 <w:color w:val="111827"/>
                 <w:sz w:val="16"/>
@@ -2189,12 +2298,12 @@
             <w:r/>
             <w:r>
               <w:rPr>
-                <w:rFonts w:ascii="Calibri" w:hAnsi="Calibri" w:eastAsia="Heiti TC"/>
+                <w:rFonts w:ascii="Calibri" w:hAnsi="Calibri" w:eastAsia="Songti SC"/>
                 <w:b w:val="0"/>
                 <w:color w:val="111827"/>
                 <w:sz w:val="17"/>
               </w:rPr>
-              <w:t>国内 AI 算力扩张的电力与电网瓶颈评估</w:t>
+              <w:t>压力测试：发电侧扩容能否真正填平AI电力缺口？</w:t>
             </w:r>
           </w:p>
         </w:tc>
@@ -2210,7 +2319,7 @@
             <w:r/>
             <w:r>
               <w:rPr>
-                <w:rFonts w:ascii="Calibri" w:hAnsi="Calibri" w:eastAsia="Heiti TC"/>
+                <w:rFonts w:ascii="Calibri" w:hAnsi="Calibri" w:eastAsia="Songti SC"/>
                 <w:b w:val="0"/>
                 <w:color w:val="111827"/>
                 <w:sz w:val="16"/>
@@ -2231,12 +2340,12 @@
             <w:r/>
             <w:r>
               <w:rPr>
-                <w:rFonts w:ascii="Calibri" w:hAnsi="Calibri" w:eastAsia="Heiti TC"/>
+                <w:rFonts w:ascii="Calibri" w:hAnsi="Calibri" w:eastAsia="Songti SC"/>
                 <w:b w:val="0"/>
                 <w:color w:val="111827"/>
                 <w:sz w:val="16"/>
               </w:rPr>
-              <w:t>AI 基础设施</w:t>
+              <w:t>电力与电网</w:t>
             </w:r>
           </w:p>
         </w:tc>
@@ -2253,12 +2362,12 @@
             <w:r/>
             <w:r>
               <w:rPr>
-                <w:rFonts w:ascii="Calibri" w:hAnsi="Calibri" w:eastAsia="Heiti TC"/>
+                <w:rFonts w:ascii="Calibri" w:hAnsi="Calibri" w:eastAsia="Songti SC"/>
                 <w:b/>
                 <w:color w:val="111827"/>
                 <w:sz w:val="17"/>
               </w:rPr>
-              <w:t>48.9</w:t>
+              <w:t>49.4</w:t>
             </w:r>
           </w:p>
         </w:tc>
@@ -2275,7 +2384,7 @@
             <w:r/>
             <w:r>
               <w:rPr>
-                <w:rFonts w:ascii="Calibri" w:hAnsi="Calibri" w:eastAsia="Heiti TC"/>
+                <w:rFonts w:ascii="Calibri" w:hAnsi="Calibri" w:eastAsia="Songti SC"/>
                 <w:b w:val="0"/>
                 <w:color w:val="111827"/>
                 <w:sz w:val="16"/>
@@ -2298,12 +2407,12 @@
             <w:r/>
             <w:r>
               <w:rPr>
-                <w:rFonts w:ascii="Calibri" w:hAnsi="Calibri" w:eastAsia="Heiti TC"/>
+                <w:rFonts w:ascii="Calibri" w:hAnsi="Calibri" w:eastAsia="Songti SC"/>
                 <w:b w:val="0"/>
                 <w:color w:val="111827"/>
                 <w:sz w:val="17"/>
               </w:rPr>
-              <w:t>AI算力电网网架物理约束与中下游估值杠杆压力测试报告</w:t>
+              <w:t>国内 AI 算力扩张的电力与电网瓶颈评估</w:t>
             </w:r>
           </w:p>
         </w:tc>
@@ -2319,7 +2428,7 @@
             <w:r/>
             <w:r>
               <w:rPr>
-                <w:rFonts w:ascii="Calibri" w:hAnsi="Calibri" w:eastAsia="Heiti TC"/>
+                <w:rFonts w:ascii="Calibri" w:hAnsi="Calibri" w:eastAsia="Songti SC"/>
                 <w:b w:val="0"/>
                 <w:color w:val="111827"/>
                 <w:sz w:val="16"/>
@@ -2340,7 +2449,7 @@
             <w:r/>
             <w:r>
               <w:rPr>
-                <w:rFonts w:ascii="Calibri" w:hAnsi="Calibri" w:eastAsia="Heiti TC"/>
+                <w:rFonts w:ascii="Calibri" w:hAnsi="Calibri" w:eastAsia="Songti SC"/>
                 <w:b w:val="0"/>
                 <w:color w:val="111827"/>
                 <w:sz w:val="16"/>
@@ -2362,12 +2471,12 @@
             <w:r/>
             <w:r>
               <w:rPr>
-                <w:rFonts w:ascii="Calibri" w:hAnsi="Calibri" w:eastAsia="Heiti TC"/>
+                <w:rFonts w:ascii="Calibri" w:hAnsi="Calibri" w:eastAsia="Songti SC"/>
                 <w:b/>
                 <w:color w:val="111827"/>
                 <w:sz w:val="17"/>
               </w:rPr>
-              <w:t>48.2</w:t>
+              <w:t>48.9</w:t>
             </w:r>
           </w:p>
         </w:tc>
@@ -2384,7 +2493,7 @@
             <w:r/>
             <w:r>
               <w:rPr>
-                <w:rFonts w:ascii="Calibri" w:hAnsi="Calibri" w:eastAsia="Heiti TC"/>
+                <w:rFonts w:ascii="Calibri" w:hAnsi="Calibri" w:eastAsia="Songti SC"/>
                 <w:b w:val="0"/>
                 <w:color w:val="111827"/>
                 <w:sz w:val="16"/>
@@ -2407,12 +2516,12 @@
             <w:r/>
             <w:r>
               <w:rPr>
-                <w:rFonts w:ascii="Calibri" w:hAnsi="Calibri" w:eastAsia="Heiti TC"/>
+                <w:rFonts w:ascii="Calibri" w:hAnsi="Calibri" w:eastAsia="Songti SC"/>
                 <w:b w:val="0"/>
                 <w:color w:val="111827"/>
                 <w:sz w:val="17"/>
               </w:rPr>
-              <w:t>AI基础设施2026-06-18</w:t>
+              <w:t>AI算力电网网架物理约束与中下游估值杠杆压力测试报告</w:t>
             </w:r>
           </w:p>
         </w:tc>
@@ -2428,7 +2537,7 @@
             <w:r/>
             <w:r>
               <w:rPr>
-                <w:rFonts w:ascii="Calibri" w:hAnsi="Calibri" w:eastAsia="Heiti TC"/>
+                <w:rFonts w:ascii="Calibri" w:hAnsi="Calibri" w:eastAsia="Songti SC"/>
                 <w:b w:val="0"/>
                 <w:color w:val="111827"/>
                 <w:sz w:val="16"/>
@@ -2449,7 +2558,7 @@
             <w:r/>
             <w:r>
               <w:rPr>
-                <w:rFonts w:ascii="Calibri" w:hAnsi="Calibri" w:eastAsia="Heiti TC"/>
+                <w:rFonts w:ascii="Calibri" w:hAnsi="Calibri" w:eastAsia="Songti SC"/>
                 <w:b w:val="0"/>
                 <w:color w:val="111827"/>
                 <w:sz w:val="16"/>
@@ -2471,7 +2580,334 @@
             <w:r/>
             <w:r>
               <w:rPr>
-                <w:rFonts w:ascii="Calibri" w:hAnsi="Calibri" w:eastAsia="Heiti TC"/>
+                <w:rFonts w:ascii="Calibri" w:hAnsi="Calibri" w:eastAsia="Songti SC"/>
+                <w:b/>
+                <w:color w:val="111827"/>
+                <w:sz w:val="17"/>
+              </w:rPr>
+              <w:t>48.2</w:t>
+            </w:r>
+          </w:p>
+        </w:tc>
+        <w:tc>
+          <w:tcPr>
+            <w:tcW w:type="dxa" w:w="1500"/>
+            <w:vAlign w:val="center"/>
+          </w:tcPr>
+          <w:p>
+            <w:pPr>
+              <w:spacing w:before="0" w:after="0"/>
+              <w:jc w:val="center"/>
+            </w:pPr>
+            <w:r/>
+            <w:r>
+              <w:rPr>
+                <w:rFonts w:ascii="Calibri" w:hAnsi="Calibri" w:eastAsia="Songti SC"/>
+                <w:b w:val="0"/>
+                <w:color w:val="111827"/>
+                <w:sz w:val="16"/>
+              </w:rPr>
+              <w:t>风险 2</w:t>
+            </w:r>
+          </w:p>
+        </w:tc>
+      </w:tr>
+      <w:tr>
+        <w:tc>
+          <w:tcPr>
+            <w:tcW w:type="dxa" w:w="3720"/>
+            <w:vAlign w:val="center"/>
+          </w:tcPr>
+          <w:p>
+            <w:pPr>
+              <w:spacing w:before="0" w:after="0"/>
+            </w:pPr>
+            <w:r/>
+            <w:r>
+              <w:rPr>
+                <w:rFonts w:ascii="Calibri" w:hAnsi="Calibri" w:eastAsia="Songti SC"/>
+                <w:b w:val="0"/>
+                <w:color w:val="111827"/>
+                <w:sz w:val="17"/>
+              </w:rPr>
+              <w:t>AI基础设施定价权迁移：从芯片稀缺转向电力与电网瓶颈</w:t>
+            </w:r>
+          </w:p>
+        </w:tc>
+        <w:tc>
+          <w:tcPr>
+            <w:tcW w:type="dxa" w:w="1560"/>
+            <w:vAlign w:val="center"/>
+          </w:tcPr>
+          <w:p>
+            <w:pPr>
+              <w:spacing w:before="0" w:after="0"/>
+            </w:pPr>
+            <w:r/>
+            <w:r>
+              <w:rPr>
+                <w:rFonts w:ascii="Calibri" w:hAnsi="Calibri" w:eastAsia="Songti SC"/>
+                <w:b w:val="0"/>
+                <w:color w:val="111827"/>
+                <w:sz w:val="16"/>
+              </w:rPr>
+              <w:t>未识别</w:t>
+            </w:r>
+          </w:p>
+        </w:tc>
+        <w:tc>
+          <w:tcPr>
+            <w:tcW w:type="dxa" w:w="1680"/>
+            <w:vAlign w:val="center"/>
+          </w:tcPr>
+          <w:p>
+            <w:pPr>
+              <w:spacing w:before="0" w:after="0"/>
+            </w:pPr>
+            <w:r/>
+            <w:r>
+              <w:rPr>
+                <w:rFonts w:ascii="Calibri" w:hAnsi="Calibri" w:eastAsia="Songti SC"/>
+                <w:b w:val="0"/>
+                <w:color w:val="111827"/>
+                <w:sz w:val="16"/>
+              </w:rPr>
+              <w:t>电力与电网</w:t>
+            </w:r>
+          </w:p>
+        </w:tc>
+        <w:tc>
+          <w:tcPr>
+            <w:tcW w:type="dxa" w:w="900"/>
+            <w:vAlign w:val="center"/>
+          </w:tcPr>
+          <w:p>
+            <w:pPr>
+              <w:spacing w:before="0" w:after="0"/>
+              <w:jc w:val="center"/>
+            </w:pPr>
+            <w:r/>
+            <w:r>
+              <w:rPr>
+                <w:rFonts w:ascii="Calibri" w:hAnsi="Calibri" w:eastAsia="Songti SC"/>
+                <w:b/>
+                <w:color w:val="111827"/>
+                <w:sz w:val="17"/>
+              </w:rPr>
+              <w:t>47.7</w:t>
+            </w:r>
+          </w:p>
+        </w:tc>
+        <w:tc>
+          <w:tcPr>
+            <w:tcW w:type="dxa" w:w="1500"/>
+            <w:vAlign w:val="center"/>
+          </w:tcPr>
+          <w:p>
+            <w:pPr>
+              <w:spacing w:before="0" w:after="0"/>
+              <w:jc w:val="center"/>
+            </w:pPr>
+            <w:r/>
+            <w:r>
+              <w:rPr>
+                <w:rFonts w:ascii="Calibri" w:hAnsi="Calibri" w:eastAsia="Songti SC"/>
+                <w:b w:val="0"/>
+                <w:color w:val="111827"/>
+                <w:sz w:val="16"/>
+              </w:rPr>
+              <w:t>风险 2</w:t>
+            </w:r>
+          </w:p>
+        </w:tc>
+      </w:tr>
+      <w:tr>
+        <w:tc>
+          <w:tcPr>
+            <w:tcW w:type="dxa" w:w="3720"/>
+            <w:vAlign w:val="center"/>
+          </w:tcPr>
+          <w:p>
+            <w:pPr>
+              <w:spacing w:before="0" w:after="0"/>
+            </w:pPr>
+            <w:r/>
+            <w:r>
+              <w:rPr>
+                <w:rFonts w:ascii="Calibri" w:hAnsi="Calibri" w:eastAsia="Songti SC"/>
+                <w:b w:val="0"/>
+                <w:color w:val="111827"/>
+                <w:sz w:val="17"/>
+              </w:rPr>
+              <w:t>变压器与电网瓶颈压力下，超大规模云厂商（Hyperscalers）的资本开支重心与数据中心部署策略演变</w:t>
+            </w:r>
+          </w:p>
+        </w:tc>
+        <w:tc>
+          <w:tcPr>
+            <w:tcW w:type="dxa" w:w="1560"/>
+            <w:vAlign w:val="center"/>
+          </w:tcPr>
+          <w:p>
+            <w:pPr>
+              <w:spacing w:before="0" w:after="0"/>
+            </w:pPr>
+            <w:r/>
+            <w:r>
+              <w:rPr>
+                <w:rFonts w:ascii="Calibri" w:hAnsi="Calibri" w:eastAsia="Songti SC"/>
+                <w:b w:val="0"/>
+                <w:color w:val="111827"/>
+                <w:sz w:val="16"/>
+              </w:rPr>
+              <w:t>未识别</w:t>
+            </w:r>
+          </w:p>
+        </w:tc>
+        <w:tc>
+          <w:tcPr>
+            <w:tcW w:type="dxa" w:w="1680"/>
+            <w:vAlign w:val="center"/>
+          </w:tcPr>
+          <w:p>
+            <w:pPr>
+              <w:spacing w:before="0" w:after="0"/>
+            </w:pPr>
+            <w:r/>
+            <w:r>
+              <w:rPr>
+                <w:rFonts w:ascii="Calibri" w:hAnsi="Calibri" w:eastAsia="Songti SC"/>
+                <w:b w:val="0"/>
+                <w:color w:val="111827"/>
+                <w:sz w:val="16"/>
+              </w:rPr>
+              <w:t>AI 基础设施</w:t>
+            </w:r>
+          </w:p>
+        </w:tc>
+        <w:tc>
+          <w:tcPr>
+            <w:tcW w:type="dxa" w:w="900"/>
+            <w:vAlign w:val="center"/>
+          </w:tcPr>
+          <w:p>
+            <w:pPr>
+              <w:spacing w:before="0" w:after="0"/>
+              <w:jc w:val="center"/>
+            </w:pPr>
+            <w:r/>
+            <w:r>
+              <w:rPr>
+                <w:rFonts w:ascii="Calibri" w:hAnsi="Calibri" w:eastAsia="Songti SC"/>
+                <w:b/>
+                <w:color w:val="111827"/>
+                <w:sz w:val="17"/>
+              </w:rPr>
+              <w:t>47.6</w:t>
+            </w:r>
+          </w:p>
+        </w:tc>
+        <w:tc>
+          <w:tcPr>
+            <w:tcW w:type="dxa" w:w="1500"/>
+            <w:vAlign w:val="center"/>
+          </w:tcPr>
+          <w:p>
+            <w:pPr>
+              <w:spacing w:before="0" w:after="0"/>
+              <w:jc w:val="center"/>
+            </w:pPr>
+            <w:r/>
+            <w:r>
+              <w:rPr>
+                <w:rFonts w:ascii="Calibri" w:hAnsi="Calibri" w:eastAsia="Songti SC"/>
+                <w:b w:val="0"/>
+                <w:color w:val="111827"/>
+                <w:sz w:val="16"/>
+              </w:rPr>
+              <w:t>风险 1</w:t>
+            </w:r>
+          </w:p>
+        </w:tc>
+      </w:tr>
+      <w:tr>
+        <w:tc>
+          <w:tcPr>
+            <w:tcW w:type="dxa" w:w="3720"/>
+            <w:vAlign w:val="center"/>
+          </w:tcPr>
+          <w:p>
+            <w:pPr>
+              <w:spacing w:before="0" w:after="0"/>
+            </w:pPr>
+            <w:r/>
+            <w:r>
+              <w:rPr>
+                <w:rFonts w:ascii="Calibri" w:hAnsi="Calibri" w:eastAsia="Songti SC"/>
+                <w:b w:val="0"/>
+                <w:color w:val="111827"/>
+                <w:sz w:val="17"/>
+              </w:rPr>
+              <w:t>AI基础设施2026-06-18</w:t>
+            </w:r>
+          </w:p>
+        </w:tc>
+        <w:tc>
+          <w:tcPr>
+            <w:tcW w:type="dxa" w:w="1560"/>
+            <w:vAlign w:val="center"/>
+          </w:tcPr>
+          <w:p>
+            <w:pPr>
+              <w:spacing w:before="0" w:after="0"/>
+            </w:pPr>
+            <w:r/>
+            <w:r>
+              <w:rPr>
+                <w:rFonts w:ascii="Calibri" w:hAnsi="Calibri" w:eastAsia="Songti SC"/>
+                <w:b w:val="0"/>
+                <w:color w:val="111827"/>
+                <w:sz w:val="16"/>
+              </w:rPr>
+              <w:t>未识别</w:t>
+            </w:r>
+          </w:p>
+        </w:tc>
+        <w:tc>
+          <w:tcPr>
+            <w:tcW w:type="dxa" w:w="1680"/>
+            <w:vAlign w:val="center"/>
+          </w:tcPr>
+          <w:p>
+            <w:pPr>
+              <w:spacing w:before="0" w:after="0"/>
+            </w:pPr>
+            <w:r/>
+            <w:r>
+              <w:rPr>
+                <w:rFonts w:ascii="Calibri" w:hAnsi="Calibri" w:eastAsia="Songti SC"/>
+                <w:b w:val="0"/>
+                <w:color w:val="111827"/>
+                <w:sz w:val="16"/>
+              </w:rPr>
+              <w:t>AI 基础设施</w:t>
+            </w:r>
+          </w:p>
+        </w:tc>
+        <w:tc>
+          <w:tcPr>
+            <w:tcW w:type="dxa" w:w="900"/>
+            <w:vAlign w:val="center"/>
+          </w:tcPr>
+          <w:p>
+            <w:pPr>
+              <w:spacing w:before="0" w:after="0"/>
+              <w:jc w:val="center"/>
+            </w:pPr>
+            <w:r/>
+            <w:r>
+              <w:rPr>
+                <w:rFonts w:ascii="Calibri" w:hAnsi="Calibri" w:eastAsia="Songti SC"/>
                 <w:b/>
                 <w:color w:val="111827"/>
                 <w:sz w:val="17"/>
@@ -2493,7 +2929,7 @@
             <w:r/>
             <w:r>
               <w:rPr>
-                <w:rFonts w:ascii="Calibri" w:hAnsi="Calibri" w:eastAsia="Heiti TC"/>
+                <w:rFonts w:ascii="Calibri" w:hAnsi="Calibri" w:eastAsia="Songti SC"/>
                 <w:b w:val="0"/>
                 <w:color w:val="111827"/>
                 <w:sz w:val="16"/>
@@ -2516,7 +2952,7 @@
             <w:r/>
             <w:r>
               <w:rPr>
-                <w:rFonts w:ascii="Calibri" w:hAnsi="Calibri" w:eastAsia="Heiti TC"/>
+                <w:rFonts w:ascii="Calibri" w:hAnsi="Calibri" w:eastAsia="Songti SC"/>
                 <w:b w:val="0"/>
                 <w:color w:val="111827"/>
                 <w:sz w:val="17"/>
@@ -2537,7 +2973,7 @@
             <w:r/>
             <w:r>
               <w:rPr>
-                <w:rFonts w:ascii="Calibri" w:hAnsi="Calibri" w:eastAsia="Heiti TC"/>
+                <w:rFonts w:ascii="Calibri" w:hAnsi="Calibri" w:eastAsia="Songti SC"/>
                 <w:b w:val="0"/>
                 <w:color w:val="111827"/>
                 <w:sz w:val="16"/>
@@ -2558,7 +2994,7 @@
             <w:r/>
             <w:r>
               <w:rPr>
-                <w:rFonts w:ascii="Calibri" w:hAnsi="Calibri" w:eastAsia="Heiti TC"/>
+                <w:rFonts w:ascii="Calibri" w:hAnsi="Calibri" w:eastAsia="Songti SC"/>
                 <w:b w:val="0"/>
                 <w:color w:val="111827"/>
                 <w:sz w:val="16"/>
@@ -2580,7 +3016,7 @@
             <w:r/>
             <w:r>
               <w:rPr>
-                <w:rFonts w:ascii="Calibri" w:hAnsi="Calibri" w:eastAsia="Heiti TC"/>
+                <w:rFonts w:ascii="Calibri" w:hAnsi="Calibri" w:eastAsia="Songti SC"/>
                 <w:b/>
                 <w:color w:val="111827"/>
                 <w:sz w:val="17"/>
@@ -2602,7 +3038,7 @@
             <w:r/>
             <w:r>
               <w:rPr>
-                <w:rFonts w:ascii="Calibri" w:hAnsi="Calibri" w:eastAsia="Heiti TC"/>
+                <w:rFonts w:ascii="Calibri" w:hAnsi="Calibri" w:eastAsia="Songti SC"/>
                 <w:b w:val="0"/>
                 <w:color w:val="111827"/>
                 <w:sz w:val="16"/>
@@ -2625,7 +3061,7 @@
             <w:r/>
             <w:r>
               <w:rPr>
-                <w:rFonts w:ascii="Calibri" w:hAnsi="Calibri" w:eastAsia="Heiti TC"/>
+                <w:rFonts w:ascii="Calibri" w:hAnsi="Calibri" w:eastAsia="Songti SC"/>
                 <w:b w:val="0"/>
                 <w:color w:val="111827"/>
                 <w:sz w:val="17"/>
@@ -2646,7 +3082,7 @@
             <w:r/>
             <w:r>
               <w:rPr>
-                <w:rFonts w:ascii="Calibri" w:hAnsi="Calibri" w:eastAsia="Heiti TC"/>
+                <w:rFonts w:ascii="Calibri" w:hAnsi="Calibri" w:eastAsia="Songti SC"/>
                 <w:b w:val="0"/>
                 <w:color w:val="111827"/>
                 <w:sz w:val="16"/>
@@ -2667,7 +3103,7 @@
             <w:r/>
             <w:r>
               <w:rPr>
-                <w:rFonts w:ascii="Calibri" w:hAnsi="Calibri" w:eastAsia="Heiti TC"/>
+                <w:rFonts w:ascii="Calibri" w:hAnsi="Calibri" w:eastAsia="Songti SC"/>
                 <w:b w:val="0"/>
                 <w:color w:val="111827"/>
                 <w:sz w:val="16"/>
@@ -2689,7 +3125,7 @@
             <w:r/>
             <w:r>
               <w:rPr>
-                <w:rFonts w:ascii="Calibri" w:hAnsi="Calibri" w:eastAsia="Heiti TC"/>
+                <w:rFonts w:ascii="Calibri" w:hAnsi="Calibri" w:eastAsia="Songti SC"/>
                 <w:b/>
                 <w:color w:val="111827"/>
                 <w:sz w:val="17"/>
@@ -2711,7 +3147,7 @@
             <w:r/>
             <w:r>
               <w:rPr>
-                <w:rFonts w:ascii="Calibri" w:hAnsi="Calibri" w:eastAsia="Heiti TC"/>
+                <w:rFonts w:ascii="Calibri" w:hAnsi="Calibri" w:eastAsia="Songti SC"/>
                 <w:b w:val="0"/>
                 <w:color w:val="111827"/>
                 <w:sz w:val="16"/>
@@ -2734,12 +3170,12 @@
             <w:r/>
             <w:r>
               <w:rPr>
-                <w:rFonts w:ascii="Calibri" w:hAnsi="Calibri" w:eastAsia="Heiti TC"/>
+                <w:rFonts w:ascii="Calibri" w:hAnsi="Calibri" w:eastAsia="Songti SC"/>
                 <w:b w:val="0"/>
                 <w:color w:val="111827"/>
                 <w:sz w:val="17"/>
               </w:rPr>
-              <w:t>中国变压器成本优势能否疏通全球 AI 电力交付瓶颈？</w:t>
+              <w:t>半导体压力测试：芯片能效与先进封装能否突破“通电围墙”？— 2026-06-18</w:t>
             </w:r>
           </w:p>
         </w:tc>
@@ -2755,7 +3191,7 @@
             <w:r/>
             <w:r>
               <w:rPr>
-                <w:rFonts w:ascii="Calibri" w:hAnsi="Calibri" w:eastAsia="Heiti TC"/>
+                <w:rFonts w:ascii="Calibri" w:hAnsi="Calibri" w:eastAsia="Songti SC"/>
                 <w:b w:val="0"/>
                 <w:color w:val="111827"/>
                 <w:sz w:val="16"/>
@@ -2776,12 +3212,12 @@
             <w:r/>
             <w:r>
               <w:rPr>
-                <w:rFonts w:ascii="Calibri" w:hAnsi="Calibri" w:eastAsia="Heiti TC"/>
+                <w:rFonts w:ascii="Calibri" w:hAnsi="Calibri" w:eastAsia="Songti SC"/>
                 <w:b w:val="0"/>
                 <w:color w:val="111827"/>
                 <w:sz w:val="16"/>
               </w:rPr>
-              <w:t>电力与电网</w:t>
+              <w:t>半导体与存储</w:t>
             </w:r>
           </w:p>
         </w:tc>
@@ -2798,12 +3234,12 @@
             <w:r/>
             <w:r>
               <w:rPr>
-                <w:rFonts w:ascii="Calibri" w:hAnsi="Calibri" w:eastAsia="Heiti TC"/>
+                <w:rFonts w:ascii="Calibri" w:hAnsi="Calibri" w:eastAsia="Songti SC"/>
                 <w:b/>
                 <w:color w:val="111827"/>
                 <w:sz w:val="17"/>
               </w:rPr>
-              <w:t>43.3</w:t>
+              <w:t>46.8</w:t>
             </w:r>
           </w:p>
         </w:tc>
@@ -2820,7 +3256,7 @@
             <w:r/>
             <w:r>
               <w:rPr>
-                <w:rFonts w:ascii="Calibri" w:hAnsi="Calibri" w:eastAsia="Heiti TC"/>
+                <w:rFonts w:ascii="Calibri" w:hAnsi="Calibri" w:eastAsia="Songti SC"/>
                 <w:b w:val="0"/>
                 <w:color w:val="111827"/>
                 <w:sz w:val="16"/>
@@ -2843,12 +3279,12 @@
             <w:r/>
             <w:r>
               <w:rPr>
-                <w:rFonts w:ascii="Calibri" w:hAnsi="Calibri" w:eastAsia="Heiti TC"/>
+                <w:rFonts w:ascii="Calibri" w:hAnsi="Calibri" w:eastAsia="Songti SC"/>
                 <w:b w:val="0"/>
                 <w:color w:val="111827"/>
                 <w:sz w:val="17"/>
               </w:rPr>
-              <w:t>2026-06-18 压力测试：Hyperscaler 7 月 Capex、能源 TCO 压力与 AI 基础设施供应链确定性</w:t>
+              <w:t>AI 能源供应“弹性”评估：可再生能源并网对缓解算力缺口的有效性</w:t>
             </w:r>
           </w:p>
         </w:tc>
@@ -2864,7 +3300,7 @@
             <w:r/>
             <w:r>
               <w:rPr>
-                <w:rFonts w:ascii="Calibri" w:hAnsi="Calibri" w:eastAsia="Heiti TC"/>
+                <w:rFonts w:ascii="Calibri" w:hAnsi="Calibri" w:eastAsia="Songti SC"/>
                 <w:b w:val="0"/>
                 <w:color w:val="111827"/>
                 <w:sz w:val="16"/>
@@ -2885,7 +3321,7 @@
             <w:r/>
             <w:r>
               <w:rPr>
-                <w:rFonts w:ascii="Calibri" w:hAnsi="Calibri" w:eastAsia="Heiti TC"/>
+                <w:rFonts w:ascii="Calibri" w:hAnsi="Calibri" w:eastAsia="Songti SC"/>
                 <w:b w:val="0"/>
                 <w:color w:val="111827"/>
                 <w:sz w:val="16"/>
@@ -2907,12 +3343,12 @@
             <w:r/>
             <w:r>
               <w:rPr>
-                <w:rFonts w:ascii="Calibri" w:hAnsi="Calibri" w:eastAsia="Heiti TC"/>
+                <w:rFonts w:ascii="Calibri" w:hAnsi="Calibri" w:eastAsia="Songti SC"/>
                 <w:b/>
                 <w:color w:val="111827"/>
                 <w:sz w:val="17"/>
               </w:rPr>
-              <w:t>43.2</w:t>
+              <w:t>46.7</w:t>
             </w:r>
           </w:p>
         </w:tc>
@@ -2929,448 +3365,12 @@
             <w:r/>
             <w:r>
               <w:rPr>
-                <w:rFonts w:ascii="Calibri" w:hAnsi="Calibri" w:eastAsia="Heiti TC"/>
+                <w:rFonts w:ascii="Calibri" w:hAnsi="Calibri" w:eastAsia="Songti SC"/>
                 <w:b w:val="0"/>
                 <w:color w:val="111827"/>
                 <w:sz w:val="16"/>
               </w:rPr>
               <w:t>风险 1</w:t>
-            </w:r>
-          </w:p>
-        </w:tc>
-      </w:tr>
-      <w:tr>
-        <w:tc>
-          <w:tcPr>
-            <w:tcW w:type="dxa" w:w="3720"/>
-            <w:vAlign w:val="center"/>
-          </w:tcPr>
-          <w:p>
-            <w:pPr>
-              <w:spacing w:before="0" w:after="0"/>
-            </w:pPr>
-            <w:r/>
-            <w:r>
-              <w:rPr>
-                <w:rFonts w:ascii="Calibri" w:hAnsi="Calibri" w:eastAsia="Heiti TC"/>
-                <w:b w:val="0"/>
-                <w:color w:val="111827"/>
-                <w:sz w:val="17"/>
-              </w:rPr>
-              <w:t>电气设备出口的贸易壁垒与安全审查：对"压制论"的压力测试</w:t>
-            </w:r>
-          </w:p>
-        </w:tc>
-        <w:tc>
-          <w:tcPr>
-            <w:tcW w:type="dxa" w:w="1560"/>
-            <w:vAlign w:val="center"/>
-          </w:tcPr>
-          <w:p>
-            <w:pPr>
-              <w:spacing w:before="0" w:after="0"/>
-            </w:pPr>
-            <w:r/>
-            <w:r>
-              <w:rPr>
-                <w:rFonts w:ascii="Calibri" w:hAnsi="Calibri" w:eastAsia="Heiti TC"/>
-                <w:b w:val="0"/>
-                <w:color w:val="111827"/>
-                <w:sz w:val="16"/>
-              </w:rPr>
-              <w:t>未识别</w:t>
-            </w:r>
-          </w:p>
-        </w:tc>
-        <w:tc>
-          <w:tcPr>
-            <w:tcW w:type="dxa" w:w="1680"/>
-            <w:vAlign w:val="center"/>
-          </w:tcPr>
-          <w:p>
-            <w:pPr>
-              <w:spacing w:before="0" w:after="0"/>
-            </w:pPr>
-            <w:r/>
-            <w:r>
-              <w:rPr>
-                <w:rFonts w:ascii="Calibri" w:hAnsi="Calibri" w:eastAsia="Heiti TC"/>
-                <w:b w:val="0"/>
-                <w:color w:val="111827"/>
-                <w:sz w:val="16"/>
-              </w:rPr>
-              <w:t>宏观通胀传导</w:t>
-            </w:r>
-          </w:p>
-        </w:tc>
-        <w:tc>
-          <w:tcPr>
-            <w:tcW w:type="dxa" w:w="900"/>
-            <w:vAlign w:val="center"/>
-          </w:tcPr>
-          <w:p>
-            <w:pPr>
-              <w:spacing w:before="0" w:after="0"/>
-              <w:jc w:val="center"/>
-            </w:pPr>
-            <w:r/>
-            <w:r>
-              <w:rPr>
-                <w:rFonts w:ascii="Calibri" w:hAnsi="Calibri" w:eastAsia="Heiti TC"/>
-                <w:b/>
-                <w:color w:val="111827"/>
-                <w:sz w:val="17"/>
-              </w:rPr>
-              <w:t>43.1</w:t>
-            </w:r>
-          </w:p>
-        </w:tc>
-        <w:tc>
-          <w:tcPr>
-            <w:tcW w:type="dxa" w:w="1500"/>
-            <w:vAlign w:val="center"/>
-          </w:tcPr>
-          <w:p>
-            <w:pPr>
-              <w:spacing w:before="0" w:after="0"/>
-              <w:jc w:val="center"/>
-            </w:pPr>
-            <w:r/>
-            <w:r>
-              <w:rPr>
-                <w:rFonts w:ascii="Calibri" w:hAnsi="Calibri" w:eastAsia="Heiti TC"/>
-                <w:b w:val="0"/>
-                <w:color w:val="111827"/>
-                <w:sz w:val="16"/>
-              </w:rPr>
-              <w:t>风险 1</w:t>
-            </w:r>
-          </w:p>
-        </w:tc>
-      </w:tr>
-      <w:tr>
-        <w:tc>
-          <w:tcPr>
-            <w:tcW w:type="dxa" w:w="3720"/>
-            <w:vAlign w:val="center"/>
-          </w:tcPr>
-          <w:p>
-            <w:pPr>
-              <w:spacing w:before="0" w:after="0"/>
-            </w:pPr>
-            <w:r/>
-            <w:r>
-              <w:rPr>
-                <w:rFonts w:ascii="Calibri" w:hAnsi="Calibri" w:eastAsia="Heiti TC"/>
-                <w:b w:val="0"/>
-                <w:color w:val="111827"/>
-                <w:sz w:val="17"/>
-              </w:rPr>
-              <w:t>交叉验证报告</w:t>
-            </w:r>
-          </w:p>
-        </w:tc>
-        <w:tc>
-          <w:tcPr>
-            <w:tcW w:type="dxa" w:w="1560"/>
-            <w:vAlign w:val="center"/>
-          </w:tcPr>
-          <w:p>
-            <w:pPr>
-              <w:spacing w:before="0" w:after="0"/>
-            </w:pPr>
-            <w:r/>
-            <w:r>
-              <w:rPr>
-                <w:rFonts w:ascii="Calibri" w:hAnsi="Calibri" w:eastAsia="Heiti TC"/>
-                <w:b w:val="0"/>
-                <w:color w:val="111827"/>
-                <w:sz w:val="16"/>
-              </w:rPr>
-              <w:t>深研主编</w:t>
-            </w:r>
-          </w:p>
-        </w:tc>
-        <w:tc>
-          <w:tcPr>
-            <w:tcW w:type="dxa" w:w="1680"/>
-            <w:vAlign w:val="center"/>
-          </w:tcPr>
-          <w:p>
-            <w:pPr>
-              <w:spacing w:before="0" w:after="0"/>
-            </w:pPr>
-            <w:r/>
-            <w:r>
-              <w:rPr>
-                <w:rFonts w:ascii="Calibri" w:hAnsi="Calibri" w:eastAsia="Heiti TC"/>
-                <w:b w:val="0"/>
-                <w:color w:val="111827"/>
-                <w:sz w:val="16"/>
-              </w:rPr>
-              <w:t>AI 基础设施</w:t>
-            </w:r>
-          </w:p>
-        </w:tc>
-        <w:tc>
-          <w:tcPr>
-            <w:tcW w:type="dxa" w:w="900"/>
-            <w:vAlign w:val="center"/>
-          </w:tcPr>
-          <w:p>
-            <w:pPr>
-              <w:spacing w:before="0" w:after="0"/>
-              <w:jc w:val="center"/>
-            </w:pPr>
-            <w:r/>
-            <w:r>
-              <w:rPr>
-                <w:rFonts w:ascii="Calibri" w:hAnsi="Calibri" w:eastAsia="Heiti TC"/>
-                <w:b/>
-                <w:color w:val="111827"/>
-                <w:sz w:val="17"/>
-              </w:rPr>
-              <w:t>43.1</w:t>
-            </w:r>
-          </w:p>
-        </w:tc>
-        <w:tc>
-          <w:tcPr>
-            <w:tcW w:type="dxa" w:w="1500"/>
-            <w:vAlign w:val="center"/>
-          </w:tcPr>
-          <w:p>
-            <w:pPr>
-              <w:spacing w:before="0" w:after="0"/>
-              <w:jc w:val="center"/>
-            </w:pPr>
-            <w:r/>
-            <w:r>
-              <w:rPr>
-                <w:rFonts w:ascii="Calibri" w:hAnsi="Calibri" w:eastAsia="Heiti TC"/>
-                <w:b w:val="0"/>
-                <w:color w:val="111827"/>
-                <w:sz w:val="16"/>
-              </w:rPr>
-              <w:t>风险 1</w:t>
-            </w:r>
-          </w:p>
-        </w:tc>
-      </w:tr>
-      <w:tr>
-        <w:tc>
-          <w:tcPr>
-            <w:tcW w:type="dxa" w:w="3720"/>
-            <w:vAlign w:val="center"/>
-          </w:tcPr>
-          <w:p>
-            <w:pPr>
-              <w:spacing w:before="0" w:after="0"/>
-            </w:pPr>
-            <w:r/>
-            <w:r>
-              <w:rPr>
-                <w:rFonts w:ascii="Calibri" w:hAnsi="Calibri" w:eastAsia="Heiti TC"/>
-                <w:b w:val="0"/>
-                <w:color w:val="111827"/>
-                <w:sz w:val="17"/>
-              </w:rPr>
-              <w:t>prior research notes｜电气设备与液冷模块标准化的供应链瓶颈</w:t>
-            </w:r>
-          </w:p>
-        </w:tc>
-        <w:tc>
-          <w:tcPr>
-            <w:tcW w:type="dxa" w:w="1560"/>
-            <w:vAlign w:val="center"/>
-          </w:tcPr>
-          <w:p>
-            <w:pPr>
-              <w:spacing w:before="0" w:after="0"/>
-            </w:pPr>
-            <w:r/>
-            <w:r>
-              <w:rPr>
-                <w:rFonts w:ascii="Calibri" w:hAnsi="Calibri" w:eastAsia="Heiti TC"/>
-                <w:b w:val="0"/>
-                <w:color w:val="111827"/>
-                <w:sz w:val="16"/>
-              </w:rPr>
-              <w:t>未识别</w:t>
-            </w:r>
-          </w:p>
-        </w:tc>
-        <w:tc>
-          <w:tcPr>
-            <w:tcW w:type="dxa" w:w="1680"/>
-            <w:vAlign w:val="center"/>
-          </w:tcPr>
-          <w:p>
-            <w:pPr>
-              <w:spacing w:before="0" w:after="0"/>
-            </w:pPr>
-            <w:r/>
-            <w:r>
-              <w:rPr>
-                <w:rFonts w:ascii="Calibri" w:hAnsi="Calibri" w:eastAsia="Heiti TC"/>
-                <w:b w:val="0"/>
-                <w:color w:val="111827"/>
-                <w:sz w:val="16"/>
-              </w:rPr>
-              <w:t>工业供给瓶颈</w:t>
-            </w:r>
-          </w:p>
-        </w:tc>
-        <w:tc>
-          <w:tcPr>
-            <w:tcW w:type="dxa" w:w="900"/>
-            <w:vAlign w:val="center"/>
-          </w:tcPr>
-          <w:p>
-            <w:pPr>
-              <w:spacing w:before="0" w:after="0"/>
-              <w:jc w:val="center"/>
-            </w:pPr>
-            <w:r/>
-            <w:r>
-              <w:rPr>
-                <w:rFonts w:ascii="Calibri" w:hAnsi="Calibri" w:eastAsia="Heiti TC"/>
-                <w:b/>
-                <w:color w:val="111827"/>
-                <w:sz w:val="17"/>
-              </w:rPr>
-              <w:t>42.0</w:t>
-            </w:r>
-          </w:p>
-        </w:tc>
-        <w:tc>
-          <w:tcPr>
-            <w:tcW w:type="dxa" w:w="1500"/>
-            <w:vAlign w:val="center"/>
-          </w:tcPr>
-          <w:p>
-            <w:pPr>
-              <w:spacing w:before="0" w:after="0"/>
-              <w:jc w:val="center"/>
-            </w:pPr>
-            <w:r/>
-            <w:r>
-              <w:rPr>
-                <w:rFonts w:ascii="Calibri" w:hAnsi="Calibri" w:eastAsia="Heiti TC"/>
-                <w:b w:val="0"/>
-                <w:color w:val="111827"/>
-                <w:sz w:val="16"/>
-              </w:rPr>
-              <w:t>风险 2</w:t>
-            </w:r>
-          </w:p>
-        </w:tc>
-      </w:tr>
-      <w:tr>
-        <w:tc>
-          <w:tcPr>
-            <w:tcW w:type="dxa" w:w="3720"/>
-            <w:vAlign w:val="center"/>
-          </w:tcPr>
-          <w:p>
-            <w:pPr>
-              <w:spacing w:before="0" w:after="0"/>
-            </w:pPr>
-            <w:r/>
-            <w:r>
-              <w:rPr>
-                <w:rFonts w:ascii="Calibri" w:hAnsi="Calibri" w:eastAsia="Heiti TC"/>
-                <w:b w:val="0"/>
-                <w:color w:val="111827"/>
-                <w:sz w:val="17"/>
-              </w:rPr>
-              <w:t>三表模型</w:t>
-            </w:r>
-          </w:p>
-        </w:tc>
-        <w:tc>
-          <w:tcPr>
-            <w:tcW w:type="dxa" w:w="1560"/>
-            <w:vAlign w:val="center"/>
-          </w:tcPr>
-          <w:p>
-            <w:pPr>
-              <w:spacing w:before="0" w:after="0"/>
-            </w:pPr>
-            <w:r/>
-            <w:r>
-              <w:rPr>
-                <w:rFonts w:ascii="Calibri" w:hAnsi="Calibri" w:eastAsia="Heiti TC"/>
-                <w:b w:val="0"/>
-                <w:color w:val="111827"/>
-                <w:sz w:val="16"/>
-              </w:rPr>
-              <w:t>深研主编</w:t>
-            </w:r>
-          </w:p>
-        </w:tc>
-        <w:tc>
-          <w:tcPr>
-            <w:tcW w:type="dxa" w:w="1680"/>
-            <w:vAlign w:val="center"/>
-          </w:tcPr>
-          <w:p>
-            <w:pPr>
-              <w:spacing w:before="0" w:after="0"/>
-            </w:pPr>
-            <w:r/>
-            <w:r>
-              <w:rPr>
-                <w:rFonts w:ascii="Calibri" w:hAnsi="Calibri" w:eastAsia="Heiti TC"/>
-                <w:b w:val="0"/>
-                <w:color w:val="111827"/>
-                <w:sz w:val="16"/>
-              </w:rPr>
-              <w:t>AI 基础设施</w:t>
-            </w:r>
-          </w:p>
-        </w:tc>
-        <w:tc>
-          <w:tcPr>
-            <w:tcW w:type="dxa" w:w="900"/>
-            <w:vAlign w:val="center"/>
-          </w:tcPr>
-          <w:p>
-            <w:pPr>
-              <w:spacing w:before="0" w:after="0"/>
-              <w:jc w:val="center"/>
-            </w:pPr>
-            <w:r/>
-            <w:r>
-              <w:rPr>
-                <w:rFonts w:ascii="Calibri" w:hAnsi="Calibri" w:eastAsia="Heiti TC"/>
-                <w:b/>
-                <w:color w:val="111827"/>
-                <w:sz w:val="17"/>
-              </w:rPr>
-              <w:t>41.7</w:t>
-            </w:r>
-          </w:p>
-        </w:tc>
-        <w:tc>
-          <w:tcPr>
-            <w:tcW w:type="dxa" w:w="1500"/>
-            <w:vAlign w:val="center"/>
-          </w:tcPr>
-          <w:p>
-            <w:pPr>
-              <w:spacing w:before="0" w:after="0"/>
-              <w:jc w:val="center"/>
-            </w:pPr>
-            <w:r/>
-            <w:r>
-              <w:rPr>
-                <w:rFonts w:ascii="Calibri" w:hAnsi="Calibri" w:eastAsia="Heiti TC"/>
-                <w:b w:val="0"/>
-                <w:color w:val="111827"/>
-                <w:sz w:val="16"/>
-              </w:rPr>
-              <w:t>常规</w:t>
             </w:r>
           </w:p>
         </w:tc>
@@ -3382,7 +3382,7 @@
       </w:pPr>
       <w:r>
         <w:rPr>
-          <w:rFonts w:ascii="Calibri" w:hAnsi="Calibri" w:eastAsia="Heiti TC"/>
+          <w:rFonts w:ascii="Calibri" w:hAnsi="Calibri" w:eastAsia="Songti SC"/>
           <w:b w:val="0"/>
           <w:i/>
           <w:color w:val="667085"/>
@@ -3412,7 +3412,7 @@
     </w:pPr>
     <w:r>
       <w:rPr>
-        <w:rFonts w:ascii="Calibri" w:hAnsi="Calibri" w:eastAsia="Heiti TC"/>
+        <w:rFonts w:ascii="Calibri" w:hAnsi="Calibri" w:eastAsia="Songti SC"/>
         <w:color w:val="667085"/>
         <w:sz w:val="17"/>
       </w:rPr>
@@ -3431,7 +3431,7 @@
     <w:r/>
     <w:r>
       <w:rPr>
-        <w:rFonts w:ascii="Calibri" w:hAnsi="Calibri" w:eastAsia="Heiti TC"/>
+        <w:rFonts w:ascii="Calibri" w:hAnsi="Calibri" w:eastAsia="Songti SC"/>
         <w:color w:val="667085"/>
         <w:sz w:val="18"/>
       </w:rPr>
@@ -3808,7 +3808,7 @@
       <w:spacing w:after="120" w:line="264" w:lineRule="auto"/>
     </w:pPr>
     <w:rPr>
-      <w:rFonts w:ascii="Calibri" w:hAnsi="Calibri" w:eastAsia="Heiti TC"/>
+      <w:rFonts w:ascii="Calibri" w:hAnsi="Calibri" w:eastAsia="Songti SC"/>
       <w:b w:val="0"/>
       <w:color w:val="111827"/>
       <w:sz w:val="22"/>
@@ -3873,7 +3873,7 @@
       <w:outlineLvl w:val="0"/>
     </w:pPr>
     <w:rPr>
-      <w:rFonts w:asciiTheme="majorHAnsi" w:eastAsiaTheme="majorEastAsia" w:hAnsiTheme="majorHAnsi" w:cstheme="majorBidi" w:ascii="Calibri" w:hAnsi="Calibri" w:eastAsia="Heiti TC"/>
+      <w:rFonts w:asciiTheme="majorHAnsi" w:eastAsiaTheme="majorEastAsia" w:hAnsiTheme="majorHAnsi" w:cstheme="majorBidi" w:ascii="Calibri" w:hAnsi="Calibri" w:eastAsia="Songti SC"/>
       <w:b/>
       <w:bCs/>
       <w:color w:val="2E74B5"/>
@@ -3897,7 +3897,7 @@
       <w:outlineLvl w:val="1"/>
     </w:pPr>
     <w:rPr>
-      <w:rFonts w:asciiTheme="majorHAnsi" w:eastAsiaTheme="majorEastAsia" w:hAnsiTheme="majorHAnsi" w:cstheme="majorBidi" w:ascii="Calibri" w:hAnsi="Calibri" w:eastAsia="Heiti TC"/>
+      <w:rFonts w:asciiTheme="majorHAnsi" w:eastAsiaTheme="majorEastAsia" w:hAnsiTheme="majorHAnsi" w:cstheme="majorBidi" w:ascii="Calibri" w:hAnsi="Calibri" w:eastAsia="Songti SC"/>
       <w:b/>
       <w:bCs/>
       <w:color w:val="2E74B5"/>
@@ -3921,7 +3921,7 @@
       <w:outlineLvl w:val="2"/>
     </w:pPr>
     <w:rPr>
-      <w:rFonts w:asciiTheme="majorHAnsi" w:eastAsiaTheme="majorEastAsia" w:hAnsiTheme="majorHAnsi" w:cstheme="majorBidi" w:ascii="Calibri" w:hAnsi="Calibri" w:eastAsia="Heiti TC"/>
+      <w:rFonts w:asciiTheme="majorHAnsi" w:eastAsiaTheme="majorEastAsia" w:hAnsiTheme="majorHAnsi" w:cstheme="majorBidi" w:ascii="Calibri" w:hAnsi="Calibri" w:eastAsia="Songti SC"/>
       <w:b/>
       <w:bCs/>
       <w:color w:val="1F4D78"/>
@@ -4163,7 +4163,7 @@
       <w:contextualSpacing/>
     </w:pPr>
     <w:rPr>
-      <w:rFonts w:asciiTheme="majorHAnsi" w:eastAsiaTheme="majorEastAsia" w:hAnsiTheme="majorHAnsi" w:cstheme="majorBidi" w:ascii="Calibri" w:hAnsi="Calibri" w:eastAsia="Heiti TC"/>
+      <w:rFonts w:asciiTheme="majorHAnsi" w:eastAsiaTheme="majorEastAsia" w:hAnsiTheme="majorHAnsi" w:cstheme="majorBidi" w:ascii="Calibri" w:hAnsi="Calibri" w:eastAsia="Songti SC"/>
       <w:b/>
       <w:color w:val="0B2545"/>
       <w:spacing w:val="5"/>
@@ -4201,7 +4201,7 @@
       </w:numPr>
     </w:pPr>
     <w:rPr>
-      <w:rFonts w:asciiTheme="majorHAnsi" w:eastAsiaTheme="majorEastAsia" w:hAnsiTheme="majorHAnsi" w:cstheme="majorBidi" w:ascii="Calibri" w:hAnsi="Calibri" w:eastAsia="Heiti TC"/>
+      <w:rFonts w:asciiTheme="majorHAnsi" w:eastAsiaTheme="majorEastAsia" w:hAnsiTheme="majorHAnsi" w:cstheme="majorBidi" w:ascii="Calibri" w:hAnsi="Calibri" w:eastAsia="Songti SC"/>
       <w:b w:val="0"/>
       <w:i/>
       <w:iCs/>

</xml_diff>